<commit_message>
updated the README.md file
</commit_message>
<xml_diff>
--- a/Evidence/NestedFieldValidationReport.docx
+++ b/Evidence/NestedFieldValidationReport.docx
@@ -93,7 +93,7 @@
             <w:sz w:val="22"/>
             <w:szCs w:val="22"/>
           </w:rPr>
-          <w:t>ea39c34</w:t>
+          <w:t>dde733e</w:t>
         </w:r>
         <w:r>
           <w:rPr>
@@ -139,7 +139,7 @@
             <w:sz w:val="22"/>
             <w:szCs w:val="22"/>
           </w:rPr>
-          <w:t>ea39c34</w:t>
+          <w:t>dde733e</w:t>
         </w:r>
         <w:r>
           <w:rPr>
@@ -983,7 +983,7 @@
           <w:sz w:val="22"/>
           <w:szCs w:val="22"/>
         </w:rPr>
-        <w:t>ea39c345b0b3d527a0c6d1abf2224f3114c77d88</w:t>
+        <w:t>dde733e3d352f079c0d11090f50afe2c42c4f7e7</w:t>
       </w:r>
     </w:p>
     <w:p>
@@ -1214,7 +1214,7 @@
           <w:sz w:val="24"/>
           <w:szCs w:val="24"/>
         </w:rPr>
-        <w:t>No required selected Static SSR behavioral check remains uncovered. Optional configurations and also-exercise items were not selected. Exact Edge and VS Code versions are documented from the installed tools rather than displayed in the original scenario recordings. The complete report still requires a separate documentation/evidence commit and manual GitHub handoff.</w:t>
+        <w:t>No required selected Static SSR behavioral check remains uncovered. Optional configurations and also-exercise items were not selected. Exact Edge and VS Code versions are documented from the installed tools rather than displayed in the original scenario recordings. The source and complete evidence are committed at dde733e3d352f079c0d11090f50afe2c42c4f7e7; only a documentation-only reference refresh and the manual GitHub issue/contact handoff remain.</w:t>
       </w:r>
     </w:p>
     <w:p>
@@ -1227,7 +1227,7 @@
     </w:p>
     <w:p>
       <w:r>
-        <w:t>Tested source and committed evidence baseline: ea39c345b0b3d527a0c6d1abf2224f3114c77d88. The README, this report, CorrectedValidPostWireEvidence.json, and CorrectedValidPostConfirmation.png are later working-tree documentation/evidence updates and must be committed as a separate report revision.</w:t>
+        <w:t>Tested source and complete committed evidence revision: dde733e3d352f079c0d11090f50afe2c42c4f7e7. It includes the report, README, corrected-valid-POST wire evidence, and confirmation screenshot as committed. This report's post-commit reference refresh is a later documentation-only working-tree update and does not change the tested evidence revision.</w:t>
       </w:r>
     </w:p>
     <w:p>
@@ -1240,7 +1240,7 @@
         <w:pStyle w:val="Heading1"/>
       </w:pPr>
       <w:r>
-        <w:t>Supplemental working-tree evidence</w:t>
+        <w:t>Supplemental committed evidence</w:t>
       </w:r>
     </w:p>
     <w:p>

</xml_diff>

<commit_message>
Updated the doc file.
</commit_message>
<xml_diff>
--- a/Evidence/NestedFieldValidationReport.docx
+++ b/Evidence/NestedFieldValidationReport.docx
@@ -4,6 +4,8 @@
   <w:body>
     <w:p>
       <w:pPr>
+        <w:pStyle w:val="Title"/>
+        <w:ind w:left="1440" w:firstLine="720"/>
         <w:rPr>
           <w:rFonts w:ascii="Calibri" w:hAnsi="Calibri" w:cs="Calibri"/>
           <w:b/>
@@ -13,15 +15,6 @@
         </w:rPr>
       </w:pPr>
       <w:r>
-        <w:tab/>
-      </w:r>
-      <w:r>
-        <w:tab/>
-      </w:r>
-      <w:r>
-        <w:tab/>
-      </w:r>
-      <w:r>
         <w:rPr>
           <w:rFonts w:ascii="Calibri" w:hAnsi="Calibri" w:cs="Calibri"/>
           <w:b/>
@@ -29,7 +22,7 @@
           <w:sz w:val="22"/>
           <w:szCs w:val="22"/>
         </w:rPr>
-        <w:t>[Validation] Nested-field validation in a static SSR form</w:t>
+        <w:t>Nested-field validation in a static SSR form</w:t>
       </w:r>
     </w:p>
     <w:p>
@@ -40,6 +33,14 @@
           <w:szCs w:val="22"/>
         </w:rPr>
       </w:pPr>
+      <w:r>
+        <w:rPr>
+          <w:rFonts w:ascii="Calibri" w:hAnsi="Calibri" w:cs="Calibri"/>
+          <w:sz w:val="22"/>
+          <w:szCs w:val="22"/>
+        </w:rPr>
+        <w:t xml:space="preserve">Scenario: </w:t>
+      </w:r>
       <w:hyperlink r:id="rId5" w:history="1">
         <w:r>
           <w:rPr>
@@ -48,7 +49,7 @@
             <w:sz w:val="22"/>
             <w:szCs w:val="22"/>
           </w:rPr>
-          <w:t>[Validation] Nested-field validation in a static SSR form · Issue #69529 · dotnet/aspnetcore</w:t>
+          <w:t>dotnet/aspnetcore#69529</w:t>
         </w:r>
       </w:hyperlink>
     </w:p>
@@ -66,17 +67,10 @@
           <w:sz w:val="22"/>
           <w:szCs w:val="22"/>
         </w:rPr>
-        <w:t>Sample Repository:</w:t>
-      </w:r>
-      <w:r>
-        <w:rPr>
-          <w:rFonts w:ascii="Calibri" w:hAnsi="Calibri" w:cs="Calibri"/>
-          <w:sz w:val="22"/>
-          <w:szCs w:val="22"/>
-        </w:rPr>
-        <w:t xml:space="preserve"> </w:t>
+        <w:t xml:space="preserve">Sample repository: </w:t>
       </w:r>
       <w:hyperlink r:id="rId6" w:history="1">
+        <w:proofErr w:type="spellStart"/>
         <w:r>
           <w:rPr>
             <w:rStyle w:val="Hyperlink"/>
@@ -84,8 +78,9 @@
             <w:sz w:val="22"/>
             <w:szCs w:val="22"/>
           </w:rPr>
-          <w:t xml:space="preserve">NestedFieldValidation/NestedValidation at </w:t>
+          <w:t>NestedValidation</w:t>
         </w:r>
+        <w:proofErr w:type="spellEnd"/>
         <w:r>
           <w:rPr>
             <w:rStyle w:val="Hyperlink"/>
@@ -93,16 +88,7 @@
             <w:sz w:val="22"/>
             <w:szCs w:val="22"/>
           </w:rPr>
-          <w:t>dde733e</w:t>
-        </w:r>
-        <w:r>
-          <w:rPr>
-            <w:rStyle w:val="Hyperlink"/>
-            <w:rFonts w:ascii="Calibri" w:hAnsi="Calibri" w:cs="Calibri"/>
-            <w:sz w:val="22"/>
-            <w:szCs w:val="22"/>
-          </w:rPr>
-          <w:t xml:space="preserve"> · NanthiniMahalingam/NestedFieldValidation</w:t>
+          <w:t xml:space="preserve"> sample</w:t>
         </w:r>
       </w:hyperlink>
     </w:p>
@@ -130,25 +116,7 @@
             <w:sz w:val="22"/>
             <w:szCs w:val="22"/>
           </w:rPr>
-          <w:t xml:space="preserve">NestedFieldValidation/Evidence at </w:t>
-        </w:r>
-        <w:r>
-          <w:rPr>
-            <w:rStyle w:val="Hyperlink"/>
-            <w:rFonts w:ascii="Calibri" w:hAnsi="Calibri" w:cs="Calibri"/>
-            <w:sz w:val="22"/>
-            <w:szCs w:val="22"/>
-          </w:rPr>
-          <w:t>dde733e</w:t>
-        </w:r>
-        <w:r>
-          <w:rPr>
-            <w:rStyle w:val="Hyperlink"/>
-            <w:rFonts w:ascii="Calibri" w:hAnsi="Calibri" w:cs="Calibri"/>
-            <w:sz w:val="22"/>
-            <w:szCs w:val="22"/>
-          </w:rPr>
-          <w:t xml:space="preserve"> · NanthiniMahalingam/NestedFieldValidation</w:t>
+          <w:t>Evidence</w:t>
         </w:r>
       </w:hyperlink>
     </w:p>
@@ -163,36 +131,51 @@
       <w:r>
         <w:rPr>
           <w:rFonts w:ascii="Calibri" w:hAnsi="Calibri" w:cs="Calibri"/>
-          <w:b/>
-          <w:bCs/>
-          <w:sz w:val="22"/>
-          <w:szCs w:val="22"/>
-        </w:rPr>
-        <w:t>Blazor web app Configurations tested in</w:t>
+          <w:sz w:val="22"/>
+          <w:szCs w:val="22"/>
+        </w:rPr>
+        <w:t>Configuration: Blazor Web App - Static SSR</w:t>
       </w:r>
+    </w:p>
+    <w:p>
+      <w:pPr>
+        <w:rPr>
+          <w:rFonts w:ascii="Calibri" w:hAnsi="Calibri" w:cs="Calibri"/>
+          <w:sz w:val="22"/>
+          <w:szCs w:val="22"/>
+        </w:rPr>
+      </w:pPr>
       <w:r>
         <w:rPr>
           <w:rFonts w:ascii="Calibri" w:hAnsi="Calibri" w:cs="Calibri"/>
           <w:sz w:val="22"/>
           <w:szCs w:val="22"/>
         </w:rPr>
-        <w:t>: Static</w:t>
+        <w:t>Test commit: dde733e3d352f079c0d11090f50afe2c42c4f7e7</w:t>
       </w:r>
+    </w:p>
+    <w:p>
+      <w:pPr>
+        <w:pStyle w:val="Heading1"/>
+        <w:rPr>
+          <w:rFonts w:ascii="Calibri" w:hAnsi="Calibri" w:cs="Calibri"/>
+          <w:sz w:val="22"/>
+          <w:szCs w:val="22"/>
+        </w:rPr>
+      </w:pPr>
       <w:r>
         <w:rPr>
           <w:rFonts w:ascii="Calibri" w:hAnsi="Calibri" w:cs="Calibri"/>
           <w:sz w:val="22"/>
           <w:szCs w:val="22"/>
         </w:rPr>
-        <w:t xml:space="preserve"> SSR </w:t>
+        <w:t>Environment</w:t>
       </w:r>
     </w:p>
     <w:p>
       <w:pPr>
         <w:rPr>
           <w:rFonts w:ascii="Calibri" w:hAnsi="Calibri" w:cs="Calibri"/>
-          <w:b/>
-          <w:bCs/>
           <w:sz w:val="22"/>
           <w:szCs w:val="22"/>
         </w:rPr>
@@ -200,20 +183,16 @@
       <w:r>
         <w:rPr>
           <w:rFonts w:ascii="Calibri" w:hAnsi="Calibri" w:cs="Calibri"/>
-          <w:b/>
-          <w:bCs/>
-          <w:sz w:val="22"/>
-          <w:szCs w:val="22"/>
-        </w:rPr>
-        <w:t>.NET SDK:</w:t>
+          <w:sz w:val="22"/>
+          <w:szCs w:val="22"/>
+        </w:rPr>
+        <w:t xml:space="preserve">.NET SDK: 11.0.100-rc.1.26425.128; </w:t>
       </w:r>
     </w:p>
     <w:p>
       <w:pPr>
         <w:rPr>
           <w:rFonts w:ascii="Calibri" w:hAnsi="Calibri" w:cs="Calibri"/>
-          <w:b/>
-          <w:bCs/>
           <w:sz w:val="22"/>
           <w:szCs w:val="22"/>
         </w:rPr>
@@ -221,20 +200,16 @@
       <w:r>
         <w:rPr>
           <w:rFonts w:ascii="Calibri" w:hAnsi="Calibri" w:cs="Calibri"/>
-          <w:b/>
-          <w:bCs/>
-          <w:sz w:val="22"/>
-          <w:szCs w:val="22"/>
-        </w:rPr>
-        <w:t xml:space="preserve"> Version:           11.0.100-rc.1.26425.128</w:t>
+          <w:sz w:val="22"/>
+          <w:szCs w:val="22"/>
+        </w:rPr>
+        <w:t xml:space="preserve">runtime: 11.0.0-rc.1.26425.128; </w:t>
       </w:r>
     </w:p>
     <w:p>
       <w:pPr>
         <w:rPr>
           <w:rFonts w:ascii="Calibri" w:hAnsi="Calibri" w:cs="Calibri"/>
-          <w:b/>
-          <w:bCs/>
           <w:sz w:val="22"/>
           <w:szCs w:val="22"/>
         </w:rPr>
@@ -242,20 +217,16 @@
       <w:r>
         <w:rPr>
           <w:rFonts w:ascii="Calibri" w:hAnsi="Calibri" w:cs="Calibri"/>
-          <w:b/>
-          <w:bCs/>
-          <w:sz w:val="22"/>
-          <w:szCs w:val="22"/>
-        </w:rPr>
-        <w:t xml:space="preserve"> Commit:            3551975be0</w:t>
+          <w:sz w:val="22"/>
+          <w:szCs w:val="22"/>
+        </w:rPr>
+        <w:t>target framework: net11.0.</w:t>
       </w:r>
     </w:p>
     <w:p>
       <w:pPr>
         <w:rPr>
           <w:rFonts w:ascii="Calibri" w:hAnsi="Calibri" w:cs="Calibri"/>
-          <w:b/>
-          <w:bCs/>
           <w:sz w:val="22"/>
           <w:szCs w:val="22"/>
         </w:rPr>
@@ -263,20 +234,16 @@
       <w:r>
         <w:rPr>
           <w:rFonts w:ascii="Calibri" w:hAnsi="Calibri" w:cs="Calibri"/>
-          <w:b/>
-          <w:bCs/>
-          <w:sz w:val="22"/>
-          <w:szCs w:val="22"/>
-        </w:rPr>
-        <w:t xml:space="preserve"> Workload version:  11.0.100-manifests.a6e318ce</w:t>
+          <w:sz w:val="22"/>
+          <w:szCs w:val="22"/>
+        </w:rPr>
+        <w:t xml:space="preserve">Windows 10.0.26200, win-x64; </w:t>
       </w:r>
     </w:p>
     <w:p>
       <w:pPr>
         <w:rPr>
           <w:rFonts w:ascii="Calibri" w:hAnsi="Calibri" w:cs="Calibri"/>
-          <w:b/>
-          <w:bCs/>
           <w:sz w:val="22"/>
           <w:szCs w:val="22"/>
         </w:rPr>
@@ -284,20 +251,16 @@
       <w:r>
         <w:rPr>
           <w:rFonts w:ascii="Calibri" w:hAnsi="Calibri" w:cs="Calibri"/>
-          <w:b/>
-          <w:bCs/>
-          <w:sz w:val="22"/>
-          <w:szCs w:val="22"/>
-        </w:rPr>
-        <w:t xml:space="preserve"> MSBuild version:   18.11.0-1.26425.128+3551975be</w:t>
+          <w:sz w:val="22"/>
+          <w:szCs w:val="22"/>
+        </w:rPr>
+        <w:t>Microsoft Edge 154.0.4258.48; Visual Studio Code 1.139.1.</w:t>
       </w:r>
     </w:p>
     <w:p>
       <w:pPr>
         <w:rPr>
           <w:rFonts w:ascii="Calibri" w:hAnsi="Calibri" w:cs="Calibri"/>
-          <w:b/>
-          <w:bCs/>
           <w:sz w:val="22"/>
           <w:szCs w:val="22"/>
         </w:rPr>
@@ -305,20 +268,17 @@
       <w:r>
         <w:rPr>
           <w:rFonts w:ascii="Calibri" w:hAnsi="Calibri" w:cs="Calibri"/>
-          <w:b/>
-          <w:bCs/>
-          <w:sz w:val="22"/>
-          <w:szCs w:val="22"/>
-        </w:rPr>
-        <w:t> </w:t>
+          <w:sz w:val="22"/>
+          <w:szCs w:val="22"/>
+        </w:rPr>
+        <w:t>Independent Release build: passed with 0 warnings and 0 errors.</w:t>
       </w:r>
     </w:p>
     <w:p>
       <w:pPr>
-        <w:rPr>
-          <w:rFonts w:ascii="Calibri" w:hAnsi="Calibri" w:cs="Calibri"/>
-          <w:b/>
-          <w:bCs/>
+        <w:pStyle w:val="Heading1"/>
+        <w:rPr>
+          <w:rFonts w:ascii="Calibri" w:hAnsi="Calibri" w:cs="Calibri"/>
           <w:sz w:val="22"/>
           <w:szCs w:val="22"/>
         </w:rPr>
@@ -326,204 +286,34 @@
       <w:r>
         <w:rPr>
           <w:rFonts w:ascii="Calibri" w:hAnsi="Calibri" w:cs="Calibri"/>
-          <w:b/>
-          <w:bCs/>
-          <w:sz w:val="22"/>
-          <w:szCs w:val="22"/>
-        </w:rPr>
-        <w:t>Runtime Environment:</w:t>
-      </w:r>
-    </w:p>
-    <w:p>
-      <w:pPr>
-        <w:rPr>
-          <w:rFonts w:ascii="Calibri" w:hAnsi="Calibri" w:cs="Calibri"/>
-          <w:b/>
-          <w:bCs/>
-          <w:sz w:val="22"/>
-          <w:szCs w:val="22"/>
-        </w:rPr>
-      </w:pPr>
-      <w:r>
-        <w:rPr>
-          <w:rFonts w:ascii="Calibri" w:hAnsi="Calibri" w:cs="Calibri"/>
-          <w:b/>
-          <w:bCs/>
-          <w:sz w:val="22"/>
-          <w:szCs w:val="22"/>
-        </w:rPr>
-        <w:t xml:space="preserve"> OS Name:     Windows</w:t>
-      </w:r>
-    </w:p>
-    <w:p>
-      <w:pPr>
-        <w:rPr>
-          <w:rFonts w:ascii="Calibri" w:hAnsi="Calibri" w:cs="Calibri"/>
-          <w:b/>
-          <w:bCs/>
-          <w:sz w:val="22"/>
-          <w:szCs w:val="22"/>
-        </w:rPr>
-      </w:pPr>
-      <w:r>
-        <w:rPr>
-          <w:rFonts w:ascii="Calibri" w:hAnsi="Calibri" w:cs="Calibri"/>
-          <w:b/>
-          <w:bCs/>
-          <w:sz w:val="22"/>
-          <w:szCs w:val="22"/>
-        </w:rPr>
-        <w:t xml:space="preserve"> OS Version:  10.0.26200</w:t>
-      </w:r>
-    </w:p>
-    <w:p>
-      <w:pPr>
-        <w:rPr>
-          <w:rFonts w:ascii="Calibri" w:hAnsi="Calibri" w:cs="Calibri"/>
-          <w:b/>
-          <w:bCs/>
-          <w:sz w:val="22"/>
-          <w:szCs w:val="22"/>
-        </w:rPr>
-      </w:pPr>
-      <w:r>
-        <w:rPr>
-          <w:rFonts w:ascii="Calibri" w:hAnsi="Calibri" w:cs="Calibri"/>
-          <w:b/>
-          <w:bCs/>
-          <w:sz w:val="22"/>
-          <w:szCs w:val="22"/>
-        </w:rPr>
-        <w:t xml:space="preserve"> OS Platform: Windows</w:t>
-      </w:r>
-    </w:p>
-    <w:p>
-      <w:pPr>
-        <w:rPr>
-          <w:rFonts w:ascii="Calibri" w:hAnsi="Calibri" w:cs="Calibri"/>
-          <w:b/>
-          <w:bCs/>
-          <w:sz w:val="22"/>
-          <w:szCs w:val="22"/>
-        </w:rPr>
-      </w:pPr>
-      <w:r>
-        <w:rPr>
-          <w:rFonts w:ascii="Calibri" w:hAnsi="Calibri" w:cs="Calibri"/>
-          <w:b/>
-          <w:bCs/>
-          <w:sz w:val="22"/>
-          <w:szCs w:val="22"/>
-        </w:rPr>
-        <w:t xml:space="preserve"> RID:         win-x64</w:t>
-      </w:r>
-    </w:p>
-    <w:p>
-      <w:pPr>
-        <w:rPr>
-          <w:rFonts w:ascii="Calibri" w:hAnsi="Calibri" w:cs="Calibri"/>
-          <w:b/>
-          <w:bCs/>
-          <w:sz w:val="22"/>
-          <w:szCs w:val="22"/>
-        </w:rPr>
-      </w:pPr>
-      <w:r>
-        <w:rPr>
-          <w:rFonts w:ascii="Calibri" w:hAnsi="Calibri" w:cs="Calibri"/>
-          <w:b/>
-          <w:bCs/>
-          <w:sz w:val="22"/>
-          <w:szCs w:val="22"/>
-        </w:rPr>
-        <w:t>Base Path:   C:\Program Files\dotnet\sdk\11.0.100-rc.1.26425.128</w:t>
-      </w:r>
-    </w:p>
-    <w:p>
-      <w:pPr>
-        <w:rPr>
-          <w:rFonts w:ascii="Calibri" w:hAnsi="Calibri" w:cs="Calibri"/>
-          <w:sz w:val="22"/>
-          <w:szCs w:val="22"/>
-        </w:rPr>
-      </w:pPr>
-      <w:r>
-        <w:rPr>
-          <w:rFonts w:ascii="Calibri" w:hAnsi="Calibri" w:cs="Calibri"/>
-          <w:b/>
-          <w:bCs/>
-          <w:sz w:val="22"/>
-          <w:szCs w:val="22"/>
-        </w:rPr>
-        <w:t>Browser:</w:t>
-      </w:r>
-      <w:r>
-        <w:rPr>
-          <w:rFonts w:ascii="Calibri" w:hAnsi="Calibri" w:cs="Calibri"/>
-          <w:sz w:val="22"/>
-          <w:szCs w:val="22"/>
-        </w:rPr>
-        <w:t> </w:t>
-      </w:r>
-      <w:r>
-        <w:rPr>
-          <w:rFonts w:ascii="Calibri" w:hAnsi="Calibri" w:cs="Calibri"/>
-          <w:sz w:val="22"/>
-          <w:szCs w:val="22"/>
-        </w:rPr>
-        <w:t xml:space="preserve">Microsoft </w:t>
-      </w:r>
-      <w:r>
-        <w:rPr>
-          <w:rFonts w:ascii="Calibri" w:hAnsi="Calibri" w:cs="Calibri"/>
-          <w:sz w:val="22"/>
-          <w:szCs w:val="22"/>
-        </w:rPr>
-        <w:t>Edge</w:t>
-      </w:r>
-    </w:p>
-    <w:p>
-      <w:pPr>
-        <w:rPr>
-          <w:rFonts w:ascii="Calibri" w:hAnsi="Calibri" w:cs="Calibri"/>
-          <w:b/>
-          <w:bCs/>
-          <w:sz w:val="22"/>
-          <w:szCs w:val="22"/>
-        </w:rPr>
-      </w:pPr>
-      <w:r>
-        <w:rPr>
-          <w:rFonts w:ascii="Calibri" w:hAnsi="Calibri" w:cs="Calibri"/>
-          <w:b/>
-          <w:bCs/>
-          <w:sz w:val="22"/>
-          <w:szCs w:val="22"/>
-        </w:rPr>
-        <w:t>Testing scenarios</w:t>
+          <w:sz w:val="22"/>
+          <w:szCs w:val="22"/>
+        </w:rPr>
+        <w:t>Test results</w:t>
       </w:r>
     </w:p>
     <w:tbl>
       <w:tblPr>
         <w:tblStyle w:val="TableGrid"/>
         <w:tblW w:w="0" w:type="auto"/>
-        <w:tblLayout w:type="fixed"/>
         <w:tblLook w:val="04A0" w:firstRow="1" w:lastRow="0" w:firstColumn="1" w:lastColumn="0" w:noHBand="0" w:noVBand="1"/>
       </w:tblPr>
       <w:tblGrid>
-        <w:gridCol w:w="1645"/>
-        <w:gridCol w:w="2760"/>
-        <w:gridCol w:w="4945"/>
+        <w:gridCol w:w="2034"/>
+        <w:gridCol w:w="4745"/>
+        <w:gridCol w:w="784"/>
+        <w:gridCol w:w="1787"/>
       </w:tblGrid>
       <w:tr>
         <w:tc>
           <w:tcPr>
-            <w:tcW w:w="1645" w:type="dxa"/>
+            <w:tcW w:w="0" w:type="auto"/>
           </w:tcPr>
           <w:p>
             <w:pPr>
               <w:rPr>
                 <w:rFonts w:ascii="Calibri" w:hAnsi="Calibri" w:cs="Calibri"/>
+                <w:b/>
                 <w:sz w:val="22"/>
                 <w:szCs w:val="22"/>
               </w:rPr>
@@ -531,21 +321,23 @@
             <w:r>
               <w:rPr>
                 <w:rFonts w:ascii="Calibri" w:hAnsi="Calibri" w:cs="Calibri"/>
-                <w:sz w:val="22"/>
-                <w:szCs w:val="22"/>
-              </w:rPr>
-              <w:t>Test scenario</w:t>
+                <w:b/>
+                <w:sz w:val="22"/>
+                <w:szCs w:val="22"/>
+              </w:rPr>
+              <w:t>Scenario</w:t>
             </w:r>
           </w:p>
         </w:tc>
         <w:tc>
           <w:tcPr>
-            <w:tcW w:w="2760" w:type="dxa"/>
+            <w:tcW w:w="0" w:type="auto"/>
           </w:tcPr>
           <w:p>
             <w:pPr>
               <w:rPr>
                 <w:rFonts w:ascii="Calibri" w:hAnsi="Calibri" w:cs="Calibri"/>
+                <w:b/>
                 <w:sz w:val="22"/>
                 <w:szCs w:val="22"/>
               </w:rPr>
@@ -553,21 +345,23 @@
             <w:r>
               <w:rPr>
                 <w:rFonts w:ascii="Calibri" w:hAnsi="Calibri" w:cs="Calibri"/>
-                <w:sz w:val="22"/>
-                <w:szCs w:val="22"/>
-              </w:rPr>
-              <w:t>Edge result</w:t>
+                <w:b/>
+                <w:sz w:val="22"/>
+                <w:szCs w:val="22"/>
+              </w:rPr>
+              <w:t>Observation</w:t>
             </w:r>
           </w:p>
         </w:tc>
         <w:tc>
           <w:tcPr>
-            <w:tcW w:w="4945" w:type="dxa"/>
+            <w:tcW w:w="0" w:type="auto"/>
           </w:tcPr>
           <w:p>
             <w:pPr>
               <w:rPr>
                 <w:rFonts w:ascii="Calibri" w:hAnsi="Calibri" w:cs="Calibri"/>
+                <w:b/>
                 <w:sz w:val="22"/>
                 <w:szCs w:val="22"/>
               </w:rPr>
@@ -575,10 +369,35 @@
             <w:r>
               <w:rPr>
                 <w:rFonts w:ascii="Calibri" w:hAnsi="Calibri" w:cs="Calibri"/>
-                <w:sz w:val="22"/>
-                <w:szCs w:val="22"/>
-              </w:rPr>
-              <w:t xml:space="preserve"> Evidence</w:t>
+                <w:b/>
+                <w:sz w:val="22"/>
+                <w:szCs w:val="22"/>
+              </w:rPr>
+              <w:t>Result</w:t>
+            </w:r>
+          </w:p>
+        </w:tc>
+        <w:tc>
+          <w:tcPr>
+            <w:tcW w:w="0" w:type="auto"/>
+          </w:tcPr>
+          <w:p>
+            <w:pPr>
+              <w:rPr>
+                <w:rFonts w:ascii="Calibri" w:hAnsi="Calibri" w:cs="Calibri"/>
+                <w:b/>
+                <w:sz w:val="22"/>
+                <w:szCs w:val="22"/>
+              </w:rPr>
+            </w:pPr>
+            <w:r>
+              <w:rPr>
+                <w:rFonts w:ascii="Calibri" w:hAnsi="Calibri" w:cs="Calibri"/>
+                <w:b/>
+                <w:sz w:val="22"/>
+                <w:szCs w:val="22"/>
+              </w:rPr>
+              <w:t>Evidence</w:t>
             </w:r>
           </w:p>
         </w:tc>
@@ -586,7 +405,7 @@
       <w:tr>
         <w:tc>
           <w:tcPr>
-            <w:tcW w:w="1645" w:type="dxa"/>
+            <w:tcW w:w="0" w:type="auto"/>
           </w:tcPr>
           <w:p>
             <w:pPr>
@@ -602,13 +421,31 @@
                 <w:sz w:val="22"/>
                 <w:szCs w:val="22"/>
               </w:rPr>
-              <w:t>An empty nested street shows a client-side message beside that input and blocks an ordinary submit without a POST</w:t>
+              <w:t xml:space="preserve">Ordinary </w:t>
+            </w:r>
+            <w:proofErr w:type="gramStart"/>
+            <w:r>
+              <w:rPr>
+                <w:rFonts w:ascii="Calibri" w:hAnsi="Calibri" w:cs="Calibri"/>
+                <w:sz w:val="22"/>
+                <w:szCs w:val="22"/>
+              </w:rPr>
+              <w:t>empty</w:t>
+            </w:r>
+            <w:proofErr w:type="gramEnd"/>
+            <w:r>
+              <w:rPr>
+                <w:rFonts w:ascii="Calibri" w:hAnsi="Calibri" w:cs="Calibri"/>
+                <w:sz w:val="22"/>
+                <w:szCs w:val="22"/>
+              </w:rPr>
+              <w:t xml:space="preserve"> submit</w:t>
             </w:r>
           </w:p>
         </w:tc>
         <w:tc>
           <w:tcPr>
-            <w:tcW w:w="2760" w:type="dxa"/>
+            <w:tcW w:w="0" w:type="auto"/>
           </w:tcPr>
           <w:p>
             <w:pPr>
@@ -624,18 +461,14 @@
                 <w:sz w:val="22"/>
                 <w:szCs w:val="22"/>
               </w:rPr>
-              <w:t>No POST was generated. The browser displayed Street is required. beside the nested field.</w:t>
+              <w:t>Street is required. appears beside the nested field and no POST is sent.</w:t>
             </w:r>
           </w:p>
-          <w:p>
-            <w:pPr>
-              <w:rPr>
-                <w:rFonts w:ascii="Calibri" w:hAnsi="Calibri" w:cs="Calibri"/>
-                <w:sz w:val="22"/>
-                <w:szCs w:val="22"/>
-              </w:rPr>
-            </w:pPr>
-          </w:p>
+        </w:tc>
+        <w:tc>
+          <w:tcPr>
+            <w:tcW w:w="0" w:type="auto"/>
+          </w:tcPr>
           <w:p>
             <w:pPr>
               <w:rPr>
@@ -656,7 +489,7 @@
         </w:tc>
         <w:tc>
           <w:tcPr>
-            <w:tcW w:w="4945" w:type="dxa"/>
+            <w:tcW w:w="0" w:type="auto"/>
           </w:tcPr>
           <w:p>
             <w:pPr>
@@ -674,25 +507,16 @@
                   <w:sz w:val="22"/>
                   <w:szCs w:val="22"/>
                 </w:rPr>
-                <w:t>NoPostResponseGetForNormalButton</w:t>
+                <w:t>Ordinary-submit recording</w:t>
               </w:r>
             </w:hyperlink>
-          </w:p>
-          <w:p>
-            <w:pPr>
-              <w:rPr>
-                <w:rFonts w:ascii="Calibri" w:hAnsi="Calibri" w:cs="Calibri"/>
-                <w:sz w:val="22"/>
-                <w:szCs w:val="22"/>
-              </w:rPr>
-            </w:pPr>
           </w:p>
         </w:tc>
       </w:tr>
       <w:tr>
         <w:tc>
           <w:tcPr>
-            <w:tcW w:w="1645" w:type="dxa"/>
+            <w:tcW w:w="0" w:type="auto"/>
           </w:tcPr>
           <w:p>
             <w:pPr>
@@ -708,31 +532,31 @@
                 <w:sz w:val="22"/>
                 <w:szCs w:val="22"/>
               </w:rPr>
-              <w:t xml:space="preserve">A formnovalidate POST with the </w:t>
+              <w:t xml:space="preserve">Empty </w:t>
             </w:r>
+            <w:proofErr w:type="spellStart"/>
             <w:r>
               <w:rPr>
                 <w:rFonts w:ascii="Calibri" w:hAnsi="Calibri" w:cs="Calibri"/>
                 <w:sz w:val="22"/>
                 <w:szCs w:val="22"/>
               </w:rPr>
-              <w:lastRenderedPageBreak/>
-              <w:t>same empty street is rejected by server validation and returns the same message beside the nested field, not only in a summary.</w:t>
+              <w:t>formnovalidate</w:t>
             </w:r>
-          </w:p>
-          <w:p>
-            <w:pPr>
-              <w:rPr>
-                <w:rFonts w:ascii="Calibri" w:hAnsi="Calibri" w:cs="Calibri"/>
-                <w:sz w:val="22"/>
-                <w:szCs w:val="22"/>
-              </w:rPr>
-            </w:pPr>
+            <w:proofErr w:type="spellEnd"/>
+            <w:r>
+              <w:rPr>
+                <w:rFonts w:ascii="Calibri" w:hAnsi="Calibri" w:cs="Calibri"/>
+                <w:sz w:val="22"/>
+                <w:szCs w:val="22"/>
+              </w:rPr>
+              <w:t xml:space="preserve"> submit</w:t>
+            </w:r>
           </w:p>
         </w:tc>
         <w:tc>
           <w:tcPr>
-            <w:tcW w:w="2760" w:type="dxa"/>
+            <w:tcW w:w="0" w:type="auto"/>
           </w:tcPr>
           <w:p>
             <w:pPr>
@@ -748,58 +572,35 @@
                 <w:sz w:val="22"/>
                 <w:szCs w:val="22"/>
               </w:rPr>
-              <w:lastRenderedPageBreak/>
-              <w:t xml:space="preserve">A POST reached the server. The form payload showed an empty </w:t>
+              <w:t>The POST contains an empty nested street; server response HTML returns the same field message and no confirmation.</w:t>
             </w:r>
-            <w:r>
-              <w:rPr>
-                <w:rFonts w:ascii="Calibri" w:hAnsi="Calibri" w:cs="Calibri"/>
-                <w:sz w:val="22"/>
-                <w:szCs w:val="22"/>
-              </w:rPr>
-              <w:lastRenderedPageBreak/>
-              <w:t>Model.ShippingAddress.Street value, and the response HTML contained the field-associated Street is required. message. The returned page displayed the same message and no order confirmation.</w:t>
-            </w:r>
-          </w:p>
-          <w:p>
-            <w:pPr>
-              <w:rPr>
-                <w:rFonts w:ascii="Calibri" w:hAnsi="Calibri" w:cs="Calibri"/>
-                <w:sz w:val="22"/>
-                <w:szCs w:val="22"/>
-              </w:rPr>
-            </w:pPr>
-          </w:p>
-          <w:p>
-            <w:pPr>
-              <w:rPr>
-                <w:rFonts w:ascii="Calibri" w:hAnsi="Calibri" w:cs="Calibri"/>
-                <w:sz w:val="22"/>
-                <w:szCs w:val="22"/>
-              </w:rPr>
-            </w:pPr>
-            <w:r>
-              <w:rPr>
-                <w:rFonts w:ascii="Calibri" w:hAnsi="Calibri" w:cs="Calibri"/>
-                <w:sz w:val="22"/>
-                <w:szCs w:val="22"/>
-              </w:rPr>
-              <w:t>Pass</w:t>
-            </w:r>
-          </w:p>
-          <w:p>
-            <w:pPr>
-              <w:rPr>
-                <w:rFonts w:ascii="Calibri" w:hAnsi="Calibri" w:cs="Calibri"/>
-                <w:sz w:val="22"/>
-                <w:szCs w:val="22"/>
-              </w:rPr>
-            </w:pPr>
           </w:p>
         </w:tc>
         <w:tc>
           <w:tcPr>
-            <w:tcW w:w="4945" w:type="dxa"/>
+            <w:tcW w:w="0" w:type="auto"/>
+          </w:tcPr>
+          <w:p>
+            <w:pPr>
+              <w:rPr>
+                <w:rFonts w:ascii="Calibri" w:hAnsi="Calibri" w:cs="Calibri"/>
+                <w:sz w:val="22"/>
+                <w:szCs w:val="22"/>
+              </w:rPr>
+            </w:pPr>
+            <w:r>
+              <w:rPr>
+                <w:rFonts w:ascii="Calibri" w:hAnsi="Calibri" w:cs="Calibri"/>
+                <w:sz w:val="22"/>
+                <w:szCs w:val="22"/>
+              </w:rPr>
+              <w:t>Pass</w:t>
+            </w:r>
+          </w:p>
+        </w:tc>
+        <w:tc>
+          <w:tcPr>
+            <w:tcW w:w="0" w:type="auto"/>
           </w:tcPr>
           <w:p>
             <w:pPr>
@@ -817,7 +618,7 @@
                   <w:sz w:val="22"/>
                   <w:szCs w:val="22"/>
                 </w:rPr>
-                <w:t>PostResponseGetAndErrorMessageShownForFormnovalidateButton</w:t>
+                <w:t>Invalid-POST wire recording</w:t>
               </w:r>
             </w:hyperlink>
           </w:p>
@@ -826,7 +627,7 @@
       <w:tr>
         <w:tc>
           <w:tcPr>
-            <w:tcW w:w="1645" w:type="dxa"/>
+            <w:tcW w:w="0" w:type="auto"/>
           </w:tcPr>
           <w:p>
             <w:pPr>
@@ -842,13 +643,13 @@
                 <w:sz w:val="22"/>
                 <w:szCs w:val="22"/>
               </w:rPr>
-              <w:t>After correcting the street, the ordinary submit reaches the server and displays the order confirmation</w:t>
+              <w:t>Corrected ordinary submit</w:t>
             </w:r>
           </w:p>
         </w:tc>
         <w:tc>
           <w:tcPr>
-            <w:tcW w:w="2760" w:type="dxa"/>
+            <w:tcW w:w="0" w:type="auto"/>
           </w:tcPr>
           <w:p>
             <w:pPr>
@@ -864,18 +665,14 @@
                 <w:sz w:val="22"/>
                 <w:szCs w:val="22"/>
               </w:rPr>
-              <w:t>A POST reached the server and the returned page displayed The order is valid and has been submitted.</w:t>
+              <w:t>The POST contains 123 Main Street; the 200 response returns the valid-order confirmation.</w:t>
             </w:r>
           </w:p>
-          <w:p>
-            <w:pPr>
-              <w:rPr>
-                <w:rFonts w:ascii="Calibri" w:hAnsi="Calibri" w:cs="Calibri"/>
-                <w:sz w:val="22"/>
-                <w:szCs w:val="22"/>
-              </w:rPr>
-            </w:pPr>
-          </w:p>
+        </w:tc>
+        <w:tc>
+          <w:tcPr>
+            <w:tcW w:w="0" w:type="auto"/>
+          </w:tcPr>
           <w:p>
             <w:pPr>
               <w:rPr>
@@ -896,7 +693,7 @@
         </w:tc>
         <w:tc>
           <w:tcPr>
-            <w:tcW w:w="4945" w:type="dxa"/>
+            <w:tcW w:w="0" w:type="auto"/>
           </w:tcPr>
           <w:p>
             <w:pPr>
@@ -914,7 +711,7 @@
                   <w:sz w:val="22"/>
                   <w:szCs w:val="22"/>
                 </w:rPr>
-                <w:t>AddedAddressedPostResponseGetForNormalButton</w:t>
+                <w:t>Corrected-POST wire evidence</w:t>
               </w:r>
             </w:hyperlink>
           </w:p>
@@ -932,6 +729,7 @@
     </w:p>
     <w:p>
       <w:pPr>
+        <w:pStyle w:val="Heading1"/>
         <w:rPr>
           <w:rFonts w:ascii="Calibri" w:hAnsi="Calibri" w:cs="Calibri"/>
           <w:sz w:val="22"/>
@@ -941,12 +739,10 @@
       <w:r>
         <w:rPr>
           <w:rFonts w:ascii="Calibri" w:hAnsi="Calibri" w:cs="Calibri"/>
-          <w:b/>
-          <w:bCs/>
-          <w:sz w:val="22"/>
-          <w:szCs w:val="22"/>
-        </w:rPr>
-        <w:t>All three selected Static SSR checks were attempted. Interactive modes and optional also-exercise items were not selected.</w:t>
+          <w:sz w:val="22"/>
+          <w:szCs w:val="22"/>
+        </w:rPr>
+        <w:t>Supporting evidence</w:t>
       </w:r>
     </w:p>
     <w:p>
@@ -957,204 +753,73 @@
           <w:szCs w:val="22"/>
         </w:rPr>
       </w:pPr>
-      <w:r>
-        <w:rPr>
-          <w:rFonts w:ascii="Calibri" w:hAnsi="Calibri" w:cs="Calibri"/>
-          <w:b/>
-          <w:bCs/>
-          <w:sz w:val="22"/>
-          <w:szCs w:val="22"/>
-        </w:rPr>
-        <w:t>Test commit version:</w:t>
-      </w:r>
-      <w:r>
-        <w:rPr>
-          <w:rFonts w:ascii="Calibri" w:hAnsi="Calibri" w:cs="Calibri"/>
-          <w:b/>
-          <w:bCs/>
-          <w:sz w:val="22"/>
-          <w:szCs w:val="22"/>
-        </w:rPr>
-        <w:t xml:space="preserve"> </w:t>
-      </w:r>
-      <w:r>
-        <w:rPr>
-          <w:rFonts w:ascii="Calibri" w:hAnsi="Calibri" w:cs="Calibri"/>
-          <w:sz w:val="22"/>
-          <w:szCs w:val="22"/>
-        </w:rPr>
-        <w:t>dde733e3d352f079c0d11090f50afe2c42c4f7e7</w:t>
-      </w:r>
-    </w:p>
-    <w:p>
-      <w:pPr>
-        <w:rPr>
-          <w:rFonts w:ascii="Calibri" w:hAnsi="Calibri" w:cs="Calibri"/>
-          <w:b/>
-          <w:bCs/>
-          <w:sz w:val="22"/>
-          <w:szCs w:val="22"/>
-        </w:rPr>
-      </w:pPr>
-      <w:r>
-        <w:rPr>
-          <w:rFonts w:ascii="Calibri" w:hAnsi="Calibri" w:cs="Calibri"/>
-          <w:b/>
-          <w:bCs/>
-          <w:sz w:val="22"/>
-          <w:szCs w:val="22"/>
-        </w:rPr>
-        <w:t>Conclusion: Recorded behavior is consistent with nested field validation working as expected</w:t>
-      </w:r>
-      <w:r>
-        <w:rPr>
-          <w:rFonts w:ascii="Calibri" w:hAnsi="Calibri" w:cs="Calibri"/>
-          <w:b/>
-          <w:bCs/>
-          <w:sz w:val="22"/>
-          <w:szCs w:val="22"/>
-        </w:rPr>
-        <w:t>.</w:t>
-      </w:r>
-    </w:p>
-    <w:p>
-      <w:pPr>
-        <w:pStyle w:val="Heading1"/>
-      </w:pPr>
-      <w:r>
-        <w:t>Environment details</w:t>
-      </w:r>
-    </w:p>
-    <w:p>
-      <w:r>
-        <w:t>Operating system: Windows 10.0.26200; OS platform Windows; RID win-x64.</w:t>
-      </w:r>
-    </w:p>
-    <w:p>
-      <w:r>
-        <w:t>Browser: Microsoft Edge 154.0.4258.48. The recording identifies Microsoft Edge; this exact installed version was recorded while finalizing the report.</w:t>
-      </w:r>
-    </w:p>
-    <w:p>
-      <w:r>
-        <w:t>IDE: Visual Studio Code 1.139.1. The exact installed version was recorded while finalizing the report.</w:t>
-      </w:r>
-    </w:p>
-    <w:p>
-      <w:r>
-        <w:t>SDK: 11.0.100-rc.1.26425.128; SDK commit 3551975be0; workload version 11.0.100-manifests.a6e318ce; MSBuild 18.11.0-1.26425.128+3551975be; base path C:\Program Files\dotnet\sdk\11.0.100-rc.1.26425.128.</w:t>
-      </w:r>
-    </w:p>
-    <w:p>
-      <w:r>
-        <w:t>Host: 11.0.0-rc.1.26425.128, x64, commit 3551975be0. The project-scoped dotnet --info resolved global.json at D:\NestedFieldValidationRepo\NestedFieldValidation\NestedValidation\global.json.</w:t>
-      </w:r>
-    </w:p>
-    <w:p>
-      <w:pPr>
-        <w:pStyle w:val="Heading1"/>
-      </w:pPr>
-      <w:r>
-        <w:lastRenderedPageBreak/>
-        <w:t>Also exercised</w:t>
-      </w:r>
-    </w:p>
-    <w:p>
-      <w:r>
-        <w:t>None. The scenario marks this selection as N/A. Published output, upgrade from .NET 10, trimming/AOT, multiple server instances or proxy, Hot Reload, equivalent IDE and command-line runs, and container execution were not selected and are not required for this scenario.</w:t>
-      </w:r>
-    </w:p>
-    <w:p>
-      <w:pPr>
-        <w:pStyle w:val="Heading1"/>
-      </w:pPr>
-      <w:r>
-        <w:t>Outcome</w:t>
-      </w:r>
-    </w:p>
-    <w:p>
-      <w:pPr>
-        <w:pStyle w:val="Heading1"/>
-        <w:rPr>
-          <w:rFonts w:asciiTheme="minorHAnsi" w:eastAsiaTheme="minorHAnsi" w:hAnsiTheme="minorHAnsi" w:cstheme="minorBidi"/>
-          <w:color w:val="auto"/>
-          <w:sz w:val="24"/>
-          <w:szCs w:val="24"/>
-        </w:rPr>
-      </w:pPr>
-      <w:r>
-        <w:rPr>
-          <w:rFonts w:asciiTheme="minorHAnsi" w:eastAsiaTheme="minorHAnsi" w:hAnsiTheme="minorHAnsi" w:cstheme="minorBidi"/>
-          <w:color w:val="auto"/>
-          <w:sz w:val="24"/>
-          <w:szCs w:val="24"/>
-        </w:rPr>
-        <w:t>Passed at the local technical-evidence boundary. All three selected Static SSR behavioral checks pass. The invalid formnovalidate recording establishes server provenance, and the supplemental privacy-redacted JSON records the generated nested required rule plus the corrected valid POST request, payload, complete 200 response body, and confirmation. No Blazor product failure was found.</w:t>
-      </w:r>
-    </w:p>
-    <w:p>
-      <w:pPr>
-        <w:pStyle w:val="Heading1"/>
-      </w:pPr>
-      <w:r>
-        <w:t>Evidence additions</w:t>
-      </w:r>
-    </w:p>
-    <w:p>
       <w:hyperlink r:id="rId11" w:history="1">
         <w:r>
           <w:rPr>
             <w:rStyle w:val="Hyperlink"/>
+            <w:rFonts w:ascii="Calibri" w:hAnsi="Calibri" w:cs="Calibri"/>
+            <w:sz w:val="22"/>
+            <w:szCs w:val="22"/>
           </w:rPr>
-          <w:t>Ordinary empty submit with Network cleared before the click</w:t>
+          <w:t>Corrected valid POST confirmation screenshot</w:t>
         </w:r>
       </w:hyperlink>
     </w:p>
     <w:p>
+      <w:pPr>
+        <w:rPr>
+          <w:rFonts w:ascii="Calibri" w:hAnsi="Calibri" w:cs="Calibri"/>
+          <w:sz w:val="22"/>
+          <w:szCs w:val="22"/>
+        </w:rPr>
+      </w:pPr>
       <w:hyperlink r:id="rId12" w:history="1">
         <w:r>
           <w:rPr>
             <w:rStyle w:val="Hyperlink"/>
+            <w:rFonts w:ascii="Calibri" w:hAnsi="Calibri" w:cs="Calibri"/>
+            <w:sz w:val="22"/>
+            <w:szCs w:val="22"/>
           </w:rPr>
-          <w:t>Invalid POST request headers, payload, and response HTML</w:t>
+          <w:t>Browser console evidence</w:t>
         </w:r>
       </w:hyperlink>
     </w:p>
     <w:p>
+      <w:pPr>
+        <w:rPr>
+          <w:rFonts w:ascii="Calibri" w:hAnsi="Calibri" w:cs="Calibri"/>
+          <w:sz w:val="22"/>
+          <w:szCs w:val="22"/>
+        </w:rPr>
+      </w:pPr>
       <w:hyperlink r:id="rId13" w:history="1">
         <w:r>
           <w:rPr>
             <w:rStyle w:val="Hyperlink"/>
+            <w:rFonts w:ascii="Calibri" w:hAnsi="Calibri" w:cs="Calibri"/>
+            <w:sz w:val="22"/>
+            <w:szCs w:val="22"/>
           </w:rPr>
-          <w:t>Invalid POST request and response headers screenshot</w:t>
+          <w:t>.NET console evidence</w:t>
         </w:r>
       </w:hyperlink>
     </w:p>
     <w:p>
+      <w:pPr>
+        <w:rPr>
+          <w:rFonts w:ascii="Calibri" w:hAnsi="Calibri" w:cs="Calibri"/>
+          <w:sz w:val="22"/>
+          <w:szCs w:val="22"/>
+        </w:rPr>
+      </w:pPr>
       <w:hyperlink r:id="rId14" w:history="1">
         <w:r>
           <w:rPr>
             <w:rStyle w:val="Hyperlink"/>
-          </w:rPr>
-          <w:t>Browser console evidence</w:t>
-        </w:r>
-      </w:hyperlink>
-    </w:p>
-    <w:p>
-      <w:hyperlink r:id="rId15" w:history="1">
-        <w:r>
-          <w:rPr>
-            <w:rStyle w:val="Hyperlink"/>
-          </w:rPr>
-          <w:t>.NET console evidence</w:t>
-        </w:r>
-      </w:hyperlink>
-    </w:p>
-    <w:p>
-      <w:hyperlink r:id="rId16" w:history="1">
-        <w:r>
-          <w:rPr>
-            <w:rStyle w:val="Hyperlink"/>
+            <w:rFonts w:ascii="Calibri" w:hAnsi="Calibri" w:cs="Calibri"/>
+            <w:sz w:val="22"/>
+            <w:szCs w:val="22"/>
           </w:rPr>
           <w:t>No warnings or errors evidence</w:t>
         </w:r>
@@ -1163,107 +828,83 @@
     <w:p>
       <w:pPr>
         <w:pStyle w:val="Heading1"/>
+        <w:rPr>
+          <w:rFonts w:ascii="Calibri" w:hAnsi="Calibri" w:cs="Calibri"/>
+          <w:sz w:val="22"/>
+          <w:szCs w:val="22"/>
+        </w:rPr>
       </w:pPr>
       <w:r>
+        <w:rPr>
+          <w:rFonts w:ascii="Calibri" w:hAnsi="Calibri" w:cs="Calibri"/>
+          <w:sz w:val="22"/>
+          <w:szCs w:val="22"/>
+        </w:rPr>
         <w:lastRenderedPageBreak/>
-        <w:t>Problems</w:t>
+        <w:t>Conclusion</w:t>
       </w:r>
     </w:p>
     <w:p>
       <w:pPr>
+        <w:rPr>
+          <w:rFonts w:ascii="Calibri" w:hAnsi="Calibri" w:cs="Calibri"/>
+          <w:sz w:val="22"/>
+          <w:szCs w:val="22"/>
+        </w:rPr>
+      </w:pPr>
+      <w:r>
+        <w:rPr>
+          <w:rFonts w:ascii="Calibri" w:hAnsi="Calibri" w:cs="Calibri"/>
+          <w:sz w:val="22"/>
+          <w:szCs w:val="22"/>
+        </w:rPr>
+        <w:t>Passed. All three selected Static SSR checks produced the expected behavior. The evidence confirms nested client validation, server rejection of the invalid bypass POST, and successful submission after correction. No Blazor product failure was found.</w:t>
+      </w:r>
+    </w:p>
+    <w:p>
+      <w:pPr>
         <w:pStyle w:val="Heading1"/>
         <w:rPr>
-          <w:rFonts w:asciiTheme="minorHAnsi" w:eastAsiaTheme="minorHAnsi" w:hAnsiTheme="minorHAnsi" w:cstheme="minorBidi"/>
-          <w:color w:val="auto"/>
-          <w:sz w:val="24"/>
-          <w:szCs w:val="24"/>
+          <w:rFonts w:ascii="Calibri" w:hAnsi="Calibri" w:cs="Calibri"/>
+          <w:sz w:val="22"/>
+          <w:szCs w:val="22"/>
         </w:rPr>
       </w:pPr>
       <w:r>
         <w:rPr>
-          <w:rFonts w:asciiTheme="minorHAnsi" w:eastAsiaTheme="minorHAnsi" w:hAnsiTheme="minorHAnsi" w:cstheme="minorBidi"/>
-          <w:color w:val="auto"/>
-          <w:sz w:val="24"/>
-          <w:szCs w:val="24"/>
-        </w:rPr>
-        <w:t>No application runtime error or Blazor product failure was found. An earlier VS Code design-time MSBuild-server timeout was tooling friction rather than an application runtime exception. A Debug validation build was blocked only because the running app held NestedValidation.exe open as PID 28440. An independent Release build then succeeded in 3.31 seconds with 0 warnings and 0 errors.</w:t>
+          <w:rFonts w:ascii="Calibri" w:hAnsi="Calibri" w:cs="Calibri"/>
+          <w:sz w:val="22"/>
+          <w:szCs w:val="22"/>
+        </w:rPr>
+        <w:t>Provenance</w:t>
       </w:r>
     </w:p>
     <w:p>
       <w:pPr>
-        <w:pStyle w:val="Heading1"/>
+        <w:rPr>
+          <w:rFonts w:ascii="Calibri" w:hAnsi="Calibri" w:cs="Calibri"/>
+          <w:sz w:val="22"/>
+          <w:szCs w:val="22"/>
+        </w:rPr>
       </w:pPr>
       <w:r>
-        <w:t>Not covered</w:t>
+        <w:rPr>
+          <w:rFonts w:ascii="Calibri" w:hAnsi="Calibri" w:cs="Calibri"/>
+          <w:sz w:val="22"/>
+          <w:szCs w:val="22"/>
+        </w:rPr>
+        <w:t>Tested source and complete committed evidence revision: dde733e3d352f079c0d11090f50afe2c42c4f7e7. This cleaned report is a documentation-only update and does not change the tested evidence revision. Posting the report to the scenario issue and notifying the scenario contact remain manual steps.</w:t>
       </w:r>
     </w:p>
     <w:p>
       <w:pPr>
-        <w:pStyle w:val="Heading1"/>
-        <w:rPr>
-          <w:rFonts w:asciiTheme="minorHAnsi" w:eastAsiaTheme="minorHAnsi" w:hAnsiTheme="minorHAnsi" w:cstheme="minorBidi"/>
-          <w:color w:val="auto"/>
-          <w:sz w:val="24"/>
-          <w:szCs w:val="24"/>
-        </w:rPr>
-      </w:pPr>
-      <w:r>
-        <w:rPr>
-          <w:rFonts w:asciiTheme="minorHAnsi" w:eastAsiaTheme="minorHAnsi" w:hAnsiTheme="minorHAnsi" w:cstheme="minorBidi"/>
-          <w:color w:val="auto"/>
-          <w:sz w:val="24"/>
-          <w:szCs w:val="24"/>
-        </w:rPr>
-        <w:t>No required selected Static SSR behavioral check remains uncovered. Optional configurations and also-exercise items were not selected. Exact Edge and VS Code versions are documented from the installed tools rather than displayed in the original scenario recordings. The source and complete evidence are committed at dde733e3d352f079c0d11090f50afe2c42c4f7e7; only a documentation-only reference refresh and the manual GitHub issue/contact handoff remain.</w:t>
-      </w:r>
-    </w:p>
-    <w:p>
-      <w:pPr>
-        <w:pStyle w:val="Heading1"/>
-      </w:pPr>
-      <w:r>
-        <w:t>Provenance and reporting status</w:t>
-      </w:r>
-    </w:p>
-    <w:p>
-      <w:r>
-        <w:t>Tested source and complete committed evidence revision: dde733e3d352f079c0d11090f50afe2c42c4f7e7. It includes the report, README, corrected-valid-POST wire evidence, and confirmation screenshot as committed. This report's post-commit reference refresh is a later documentation-only working-tree update and does not change the tested evidence revision.</w:t>
-      </w:r>
-    </w:p>
-    <w:p>
-      <w:r>
-        <w:t>Posting this report to dotnet/aspnetcore#69529 and handing it to the scenario contact are manual steps and are not established by the local repository.</w:t>
-      </w:r>
-    </w:p>
-    <w:p>
-      <w:pPr>
-        <w:pStyle w:val="Heading1"/>
-      </w:pPr>
-      <w:r>
-        <w:t>Supplemental committed evidence</w:t>
-      </w:r>
-    </w:p>
-    <w:p>
-      <w:hyperlink r:id="rId17" w:history="1">
-        <w:r>
-          <w:rPr>
-            <w:rStyle w:val="Hyperlink"/>
-          </w:rPr>
-          <w:t>Corrected valid POST wire evidence and generated nested-rule markup</w:t>
-        </w:r>
-      </w:hyperlink>
-    </w:p>
-    <w:p>
-      <w:hyperlink r:id="rId18" w:history="1">
-        <w:r>
-          <w:rPr>
-            <w:rStyle w:val="Hyperlink"/>
-          </w:rPr>
-          <w:t>Corrected valid POST confirmation screenshot</w:t>
-        </w:r>
-      </w:hyperlink>
-    </w:p>
-    <w:p/>
+        <w:rPr>
+          <w:rFonts w:ascii="Calibri" w:hAnsi="Calibri" w:cs="Calibri"/>
+          <w:sz w:val="22"/>
+          <w:szCs w:val="22"/>
+        </w:rPr>
+      </w:pPr>
+    </w:p>
     <w:sectPr>
       <w:pgSz w:w="12240" w:h="15840"/>
       <w:pgMar w:top="1440" w:right="1440" w:bottom="1440" w:left="1440" w:header="720" w:footer="720" w:gutter="0"/>
@@ -2390,6 +2031,18 @@
       </w:tblBorders>
     </w:tblPr>
   </w:style>
+  <w:style w:type="character" w:styleId="FollowedHyperlink">
+    <w:name w:val="FollowedHyperlink"/>
+    <w:basedOn w:val="DefaultParagraphFont"/>
+    <w:uiPriority w:val="99"/>
+    <w:semiHidden/>
+    <w:unhideWhenUsed/>
+    <w:rsid w:val="00F95D4D"/>
+    <w:rPr>
+      <w:color w:val="96607D" w:themeColor="followedHyperlink"/>
+      <w:u w:val="single"/>
+    </w:rPr>
+  </w:style>
 </w:styles>
 </file>
 

</xml_diff>

<commit_message>
I have updated the README.md and report doc file.
</commit_message>
<xml_diff>
--- a/Evidence/NestedFieldValidationReport.docx
+++ b/Evidence/NestedFieldValidationReport.docx
@@ -5,13 +5,12 @@
     <w:p>
       <w:pPr>
         <w:pStyle w:val="Title"/>
-        <w:ind w:left="1440" w:firstLine="720"/>
         <w:rPr>
           <w:rFonts w:ascii="Calibri" w:hAnsi="Calibri" w:cs="Calibri"/>
           <w:b/>
           <w:bCs/>
-          <w:sz w:val="22"/>
-          <w:szCs w:val="22"/>
+          <w:sz w:val="32"/>
+          <w:szCs w:val="32"/>
         </w:rPr>
       </w:pPr>
       <w:r>
@@ -19,8 +18,8 @@
           <w:rFonts w:ascii="Calibri" w:hAnsi="Calibri" w:cs="Calibri"/>
           <w:b/>
           <w:bCs/>
-          <w:sz w:val="22"/>
-          <w:szCs w:val="22"/>
+          <w:sz w:val="32"/>
+          <w:szCs w:val="32"/>
         </w:rPr>
         <w:t>Nested-field validation in a static SSR form</w:t>
       </w:r>
@@ -29,15 +28,11 @@
       <w:pPr>
         <w:rPr>
           <w:rFonts w:ascii="Calibri" w:hAnsi="Calibri" w:cs="Calibri"/>
-          <w:sz w:val="22"/>
-          <w:szCs w:val="22"/>
-        </w:rPr>
-      </w:pPr>
-      <w:r>
-        <w:rPr>
-          <w:rFonts w:ascii="Calibri" w:hAnsi="Calibri" w:cs="Calibri"/>
-          <w:sz w:val="22"/>
-          <w:szCs w:val="22"/>
+        </w:rPr>
+      </w:pPr>
+      <w:r>
+        <w:rPr>
+          <w:rFonts w:ascii="Calibri" w:hAnsi="Calibri" w:cs="Calibri"/>
         </w:rPr>
         <w:t xml:space="preserve">Scenario: </w:t>
       </w:r>
@@ -46,8 +41,6 @@
           <w:rPr>
             <w:rStyle w:val="Hyperlink"/>
             <w:rFonts w:ascii="Calibri" w:hAnsi="Calibri" w:cs="Calibri"/>
-            <w:sz w:val="22"/>
-            <w:szCs w:val="22"/>
           </w:rPr>
           <w:t>dotnet/aspnetcore#69529</w:t>
         </w:r>
@@ -57,17 +50,13 @@
       <w:pPr>
         <w:rPr>
           <w:rFonts w:ascii="Calibri" w:hAnsi="Calibri" w:cs="Calibri"/>
-          <w:sz w:val="22"/>
-          <w:szCs w:val="22"/>
-        </w:rPr>
-      </w:pPr>
-      <w:r>
-        <w:rPr>
-          <w:rFonts w:ascii="Calibri" w:hAnsi="Calibri" w:cs="Calibri"/>
-          <w:sz w:val="22"/>
-          <w:szCs w:val="22"/>
-        </w:rPr>
-        <w:t xml:space="preserve">Sample repository: </w:t>
+        </w:rPr>
+      </w:pPr>
+      <w:r>
+        <w:rPr>
+          <w:rFonts w:ascii="Calibri" w:hAnsi="Calibri" w:cs="Calibri"/>
+        </w:rPr>
+        <w:t xml:space="preserve">Sample app: </w:t>
       </w:r>
       <w:hyperlink r:id="rId6" w:history="1">
         <w:proofErr w:type="spellStart"/>
@@ -75,8 +64,6 @@
           <w:rPr>
             <w:rStyle w:val="Hyperlink"/>
             <w:rFonts w:ascii="Calibri" w:hAnsi="Calibri" w:cs="Calibri"/>
-            <w:sz w:val="22"/>
-            <w:szCs w:val="22"/>
           </w:rPr>
           <w:t>NestedValidation</w:t>
         </w:r>
@@ -85,8 +72,6 @@
           <w:rPr>
             <w:rStyle w:val="Hyperlink"/>
             <w:rFonts w:ascii="Calibri" w:hAnsi="Calibri" w:cs="Calibri"/>
-            <w:sz w:val="22"/>
-            <w:szCs w:val="22"/>
           </w:rPr>
           <w:t xml:space="preserve"> sample</w:t>
         </w:r>
@@ -96,15 +81,11 @@
       <w:pPr>
         <w:rPr>
           <w:rFonts w:ascii="Calibri" w:hAnsi="Calibri" w:cs="Calibri"/>
-          <w:sz w:val="22"/>
-          <w:szCs w:val="22"/>
-        </w:rPr>
-      </w:pPr>
-      <w:r>
-        <w:rPr>
-          <w:rFonts w:ascii="Calibri" w:hAnsi="Calibri" w:cs="Calibri"/>
-          <w:sz w:val="22"/>
-          <w:szCs w:val="22"/>
+        </w:rPr>
+      </w:pPr>
+      <w:r>
+        <w:rPr>
+          <w:rFonts w:ascii="Calibri" w:hAnsi="Calibri" w:cs="Calibri"/>
         </w:rPr>
         <w:t xml:space="preserve">Evidence: </w:t>
       </w:r>
@@ -113,10 +94,8 @@
           <w:rPr>
             <w:rStyle w:val="Hyperlink"/>
             <w:rFonts w:ascii="Calibri" w:hAnsi="Calibri" w:cs="Calibri"/>
-            <w:sz w:val="22"/>
-            <w:szCs w:val="22"/>
           </w:rPr>
-          <w:t>Evidence</w:t>
+          <w:t>Committed evidence</w:t>
         </w:r>
       </w:hyperlink>
     </w:p>
@@ -124,34 +103,19 @@
       <w:pPr>
         <w:rPr>
           <w:rFonts w:ascii="Calibri" w:hAnsi="Calibri" w:cs="Calibri"/>
-          <w:sz w:val="22"/>
-          <w:szCs w:val="22"/>
-        </w:rPr>
-      </w:pPr>
-      <w:r>
-        <w:rPr>
-          <w:rFonts w:ascii="Calibri" w:hAnsi="Calibri" w:cs="Calibri"/>
-          <w:sz w:val="22"/>
-          <w:szCs w:val="22"/>
-        </w:rPr>
-        <w:t>Configuration: Blazor Web App - Static SSR</w:t>
-      </w:r>
-    </w:p>
-    <w:p>
-      <w:pPr>
-        <w:rPr>
-          <w:rFonts w:ascii="Calibri" w:hAnsi="Calibri" w:cs="Calibri"/>
-          <w:sz w:val="22"/>
-          <w:szCs w:val="22"/>
-        </w:rPr>
-      </w:pPr>
-      <w:r>
-        <w:rPr>
-          <w:rFonts w:ascii="Calibri" w:hAnsi="Calibri" w:cs="Calibri"/>
-          <w:sz w:val="22"/>
-          <w:szCs w:val="22"/>
-        </w:rPr>
-        <w:t>Test commit: dde733e3d352f079c0d11090f50afe2c42c4f7e7</w:t>
+        </w:rPr>
+      </w:pPr>
+      <w:r>
+        <w:rPr>
+          <w:rFonts w:ascii="Calibri" w:hAnsi="Calibri" w:cs="Calibri"/>
+        </w:rPr>
+        <w:t xml:space="preserve">Test commit: </w:t>
+      </w:r>
+      <w:r>
+        <w:rPr>
+          <w:rFonts w:ascii="Calibri" w:hAnsi="Calibri" w:cs="Calibri"/>
+        </w:rPr>
+        <w:t>f01040bd205f6aade6c1e9e5ec45cc47c397c1c3</w:t>
       </w:r>
     </w:p>
     <w:p>
@@ -159,119 +123,185 @@
         <w:pStyle w:val="Heading1"/>
         <w:rPr>
           <w:rFonts w:ascii="Calibri" w:hAnsi="Calibri" w:cs="Calibri"/>
-          <w:sz w:val="22"/>
-          <w:szCs w:val="22"/>
-        </w:rPr>
-      </w:pPr>
-      <w:r>
-        <w:rPr>
-          <w:rFonts w:ascii="Calibri" w:hAnsi="Calibri" w:cs="Calibri"/>
-          <w:sz w:val="22"/>
-          <w:szCs w:val="22"/>
-        </w:rPr>
-        <w:t>Environment</w:t>
-      </w:r>
-    </w:p>
-    <w:p>
-      <w:pPr>
-        <w:rPr>
-          <w:rFonts w:ascii="Calibri" w:hAnsi="Calibri" w:cs="Calibri"/>
-          <w:sz w:val="22"/>
-          <w:szCs w:val="22"/>
-        </w:rPr>
-      </w:pPr>
-      <w:r>
-        <w:rPr>
-          <w:rFonts w:ascii="Calibri" w:hAnsi="Calibri" w:cs="Calibri"/>
-          <w:sz w:val="22"/>
-          <w:szCs w:val="22"/>
-        </w:rPr>
-        <w:t xml:space="preserve">.NET SDK: 11.0.100-rc.1.26425.128; </w:t>
-      </w:r>
-    </w:p>
-    <w:p>
-      <w:pPr>
-        <w:rPr>
-          <w:rFonts w:ascii="Calibri" w:hAnsi="Calibri" w:cs="Calibri"/>
-          <w:sz w:val="22"/>
-          <w:szCs w:val="22"/>
-        </w:rPr>
-      </w:pPr>
-      <w:r>
-        <w:rPr>
-          <w:rFonts w:ascii="Calibri" w:hAnsi="Calibri" w:cs="Calibri"/>
-          <w:sz w:val="22"/>
-          <w:szCs w:val="22"/>
-        </w:rPr>
-        <w:t xml:space="preserve">runtime: 11.0.0-rc.1.26425.128; </w:t>
-      </w:r>
-    </w:p>
-    <w:p>
-      <w:pPr>
-        <w:rPr>
-          <w:rFonts w:ascii="Calibri" w:hAnsi="Calibri" w:cs="Calibri"/>
-          <w:sz w:val="22"/>
-          <w:szCs w:val="22"/>
-        </w:rPr>
-      </w:pPr>
-      <w:r>
-        <w:rPr>
-          <w:rFonts w:ascii="Calibri" w:hAnsi="Calibri" w:cs="Calibri"/>
-          <w:sz w:val="22"/>
-          <w:szCs w:val="22"/>
-        </w:rPr>
-        <w:t>target framework: net11.0.</w:t>
-      </w:r>
-    </w:p>
-    <w:p>
-      <w:pPr>
-        <w:rPr>
-          <w:rFonts w:ascii="Calibri" w:hAnsi="Calibri" w:cs="Calibri"/>
-          <w:sz w:val="22"/>
-          <w:szCs w:val="22"/>
-        </w:rPr>
-      </w:pPr>
-      <w:r>
-        <w:rPr>
-          <w:rFonts w:ascii="Calibri" w:hAnsi="Calibri" w:cs="Calibri"/>
-          <w:sz w:val="22"/>
-          <w:szCs w:val="22"/>
-        </w:rPr>
-        <w:t xml:space="preserve">Windows 10.0.26200, win-x64; </w:t>
-      </w:r>
-    </w:p>
-    <w:p>
-      <w:pPr>
-        <w:rPr>
-          <w:rFonts w:ascii="Calibri" w:hAnsi="Calibri" w:cs="Calibri"/>
-          <w:sz w:val="22"/>
-          <w:szCs w:val="22"/>
-        </w:rPr>
-      </w:pPr>
-      <w:r>
-        <w:rPr>
-          <w:rFonts w:ascii="Calibri" w:hAnsi="Calibri" w:cs="Calibri"/>
-          <w:sz w:val="22"/>
-          <w:szCs w:val="22"/>
-        </w:rPr>
-        <w:t>Microsoft Edge 154.0.4258.48; Visual Studio Code 1.139.1.</w:t>
-      </w:r>
-    </w:p>
-    <w:p>
-      <w:pPr>
-        <w:rPr>
-          <w:rFonts w:ascii="Calibri" w:hAnsi="Calibri" w:cs="Calibri"/>
-          <w:sz w:val="22"/>
-          <w:szCs w:val="22"/>
-        </w:rPr>
-      </w:pPr>
-      <w:r>
-        <w:rPr>
-          <w:rFonts w:ascii="Calibri" w:hAnsi="Calibri" w:cs="Calibri"/>
-          <w:sz w:val="22"/>
-          <w:szCs w:val="22"/>
-        </w:rPr>
-        <w:t>Independent Release build: passed with 0 warnings and 0 errors.</w:t>
+        </w:rPr>
+      </w:pPr>
+      <w:r>
+        <w:rPr>
+          <w:rFonts w:ascii="Calibri" w:hAnsi="Calibri" w:cs="Calibri"/>
+        </w:rPr>
+        <w:t>Required report fields</w:t>
+      </w:r>
+    </w:p>
+    <w:p>
+      <w:pPr>
+        <w:rPr>
+          <w:rFonts w:ascii="Calibri" w:hAnsi="Calibri" w:cs="Calibri"/>
+        </w:rPr>
+      </w:pPr>
+      <w:r>
+        <w:rPr>
+          <w:rFonts w:ascii="Calibri" w:hAnsi="Calibri" w:cs="Calibri"/>
+        </w:rPr>
+        <w:t>Build tested: .NET SDK 11.0.100-rc.1.26425.128; runtime 11.0.0-rc.1.26425.128; target framework net11.0. Independent Release build passed with 0 warnings and 0 errors.</w:t>
+      </w:r>
+    </w:p>
+    <w:p>
+      <w:pPr>
+        <w:rPr>
+          <w:rFonts w:ascii="Calibri" w:hAnsi="Calibri" w:cs="Calibri"/>
+        </w:rPr>
+      </w:pPr>
+      <w:r>
+        <w:rPr>
+          <w:rFonts w:ascii="Calibri" w:hAnsi="Calibri" w:cs="Calibri"/>
+        </w:rPr>
+        <w:t>Configurations tested: Blazor Web App - Static SSR.</w:t>
+      </w:r>
+    </w:p>
+    <w:p>
+      <w:pPr>
+        <w:rPr>
+          <w:rFonts w:ascii="Calibri" w:hAnsi="Calibri" w:cs="Calibri"/>
+        </w:rPr>
+      </w:pPr>
+      <w:r>
+        <w:rPr>
+          <w:rFonts w:ascii="Calibri" w:hAnsi="Calibri" w:cs="Calibri"/>
+        </w:rPr>
+        <w:t>Also exercised: none (N/A for this scenario).</w:t>
+      </w:r>
+    </w:p>
+    <w:p>
+      <w:pPr>
+        <w:rPr>
+          <w:rFonts w:ascii="Calibri" w:hAnsi="Calibri" w:cs="Calibri"/>
+        </w:rPr>
+      </w:pPr>
+      <w:r>
+        <w:rPr>
+          <w:rFonts w:ascii="Calibri" w:hAnsi="Calibri" w:cs="Calibri"/>
+        </w:rPr>
+        <w:t>OS: Microsoft Windows 11 Enterprise; underlying OS version 10.0.26200, build 26200; win-x64.</w:t>
+      </w:r>
+    </w:p>
+    <w:p>
+      <w:pPr>
+        <w:rPr>
+          <w:rFonts w:ascii="Calibri" w:hAnsi="Calibri" w:cs="Calibri"/>
+        </w:rPr>
+      </w:pPr>
+      <w:r>
+        <w:rPr>
+          <w:rFonts w:ascii="Calibri" w:hAnsi="Calibri" w:cs="Calibri"/>
+        </w:rPr>
+        <w:t>Browser: Microsoft Edge 154.0.4258.48.</w:t>
+      </w:r>
+    </w:p>
+    <w:p>
+      <w:pPr>
+        <w:rPr>
+          <w:rFonts w:ascii="Calibri" w:hAnsi="Calibri" w:cs="Calibri"/>
+        </w:rPr>
+      </w:pPr>
+      <w:r>
+        <w:rPr>
+          <w:rFonts w:ascii="Calibri" w:hAnsi="Calibri" w:cs="Calibri"/>
+        </w:rPr>
+        <w:t>IDE: Visual Studio Professional 18.10.12224.181 and Visual Studio Code 1.139.1.</w:t>
+      </w:r>
+    </w:p>
+    <w:p>
+      <w:pPr>
+        <w:rPr>
+          <w:rFonts w:ascii="Calibri" w:hAnsi="Calibri" w:cs="Calibri"/>
+        </w:rPr>
+      </w:pPr>
+      <w:r>
+        <w:rPr>
+          <w:rFonts w:ascii="Calibri" w:hAnsi="Calibri" w:cs="Calibri"/>
+        </w:rPr>
+        <w:t xml:space="preserve">IDE evidence mapping: Visual Studio produced NoWarningsAndErrorsFound.png </w:t>
+      </w:r>
+      <w:proofErr w:type="gramStart"/>
+      <w:r>
+        <w:rPr>
+          <w:rFonts w:ascii="Calibri" w:hAnsi="Calibri" w:cs="Calibri"/>
+        </w:rPr>
+        <w:t>and .</w:t>
+      </w:r>
+      <w:proofErr w:type="gramEnd"/>
+      <w:r>
+        <w:rPr>
+          <w:rFonts w:ascii="Calibri" w:hAnsi="Calibri" w:cs="Calibri"/>
+        </w:rPr>
+        <w:t xml:space="preserve">NETConsoleOutput.png. Visual Studio Code and its Electron browser context produced </w:t>
+      </w:r>
+      <w:proofErr w:type="spellStart"/>
+      <w:r>
+        <w:rPr>
+          <w:rFonts w:ascii="Calibri" w:hAnsi="Calibri" w:cs="Calibri"/>
+        </w:rPr>
+        <w:t>CorrectedValidPostWireEvidence.json</w:t>
+      </w:r>
+      <w:proofErr w:type="spellEnd"/>
+      <w:r>
+        <w:rPr>
+          <w:rFonts w:ascii="Calibri" w:hAnsi="Calibri" w:cs="Calibri"/>
+        </w:rPr>
+        <w:t xml:space="preserve"> and CorrectedValidPostConfirmation.png.</w:t>
+      </w:r>
+    </w:p>
+    <w:p>
+      <w:pPr>
+        <w:rPr>
+          <w:rFonts w:ascii="Calibri" w:hAnsi="Calibri" w:cs="Calibri"/>
+        </w:rPr>
+      </w:pPr>
+      <w:r>
+        <w:rPr>
+          <w:rFonts w:ascii="Calibri" w:hAnsi="Calibri" w:cs="Calibri"/>
+        </w:rPr>
+        <w:t xml:space="preserve">Outcome: </w:t>
+      </w:r>
+      <w:proofErr w:type="gramStart"/>
+      <w:r>
+        <w:rPr>
+          <w:rFonts w:ascii="Calibri" w:hAnsi="Calibri" w:cs="Calibri"/>
+        </w:rPr>
+        <w:t>works</w:t>
+      </w:r>
+      <w:proofErr w:type="gramEnd"/>
+      <w:r>
+        <w:rPr>
+          <w:rFonts w:ascii="Calibri" w:hAnsi="Calibri" w:cs="Calibri"/>
+        </w:rPr>
+        <w:t>.</w:t>
+      </w:r>
+    </w:p>
+    <w:p>
+      <w:pPr>
+        <w:rPr>
+          <w:rFonts w:ascii="Calibri" w:hAnsi="Calibri" w:cs="Calibri"/>
+        </w:rPr>
+      </w:pPr>
+      <w:r>
+        <w:rPr>
+          <w:rFonts w:ascii="Calibri" w:hAnsi="Calibri" w:cs="Calibri"/>
+        </w:rPr>
+        <w:t>Problems: none.</w:t>
+      </w:r>
+    </w:p>
+    <w:p>
+      <w:pPr>
+        <w:rPr>
+          <w:rFonts w:ascii="Calibri" w:hAnsi="Calibri" w:cs="Calibri"/>
+        </w:rPr>
+      </w:pPr>
+      <w:r>
+        <w:rPr>
+          <w:rFonts w:ascii="Calibri" w:hAnsi="Calibri" w:cs="Calibri"/>
+        </w:rPr>
+        <w:t>Not covered: none for the selected Static SSR configuration. Optional configurations and also-exercise items were not selected.</w:t>
       </w:r>
     </w:p>
     <w:p>
@@ -279,17 +309,13 @@
         <w:pStyle w:val="Heading1"/>
         <w:rPr>
           <w:rFonts w:ascii="Calibri" w:hAnsi="Calibri" w:cs="Calibri"/>
-          <w:sz w:val="22"/>
-          <w:szCs w:val="22"/>
-        </w:rPr>
-      </w:pPr>
-      <w:r>
-        <w:rPr>
-          <w:rFonts w:ascii="Calibri" w:hAnsi="Calibri" w:cs="Calibri"/>
-          <w:sz w:val="22"/>
-          <w:szCs w:val="22"/>
-        </w:rPr>
-        <w:t>Test results</w:t>
+        </w:rPr>
+      </w:pPr>
+      <w:r>
+        <w:rPr>
+          <w:rFonts w:ascii="Calibri" w:hAnsi="Calibri" w:cs="Calibri"/>
+        </w:rPr>
+        <w:t>Checks</w:t>
       </w:r>
     </w:p>
     <w:tbl>
@@ -299,10 +325,10 @@
         <w:tblLook w:val="04A0" w:firstRow="1" w:lastRow="0" w:firstColumn="1" w:lastColumn="0" w:noHBand="0" w:noVBand="1"/>
       </w:tblPr>
       <w:tblGrid>
-        <w:gridCol w:w="2034"/>
-        <w:gridCol w:w="4745"/>
-        <w:gridCol w:w="784"/>
-        <w:gridCol w:w="1787"/>
+        <w:gridCol w:w="2120"/>
+        <w:gridCol w:w="4573"/>
+        <w:gridCol w:w="836"/>
+        <w:gridCol w:w="1821"/>
       </w:tblGrid>
       <w:tr>
         <w:tc>
@@ -314,18 +340,14 @@
               <w:rPr>
                 <w:rFonts w:ascii="Calibri" w:hAnsi="Calibri" w:cs="Calibri"/>
                 <w:b/>
-                <w:sz w:val="22"/>
-                <w:szCs w:val="22"/>
               </w:rPr>
             </w:pPr>
             <w:r>
               <w:rPr>
                 <w:rFonts w:ascii="Calibri" w:hAnsi="Calibri" w:cs="Calibri"/>
                 <w:b/>
-                <w:sz w:val="22"/>
-                <w:szCs w:val="22"/>
-              </w:rPr>
-              <w:t>Scenario</w:t>
+              </w:rPr>
+              <w:t>Check</w:t>
             </w:r>
           </w:p>
         </w:tc>
@@ -338,16 +360,12 @@
               <w:rPr>
                 <w:rFonts w:ascii="Calibri" w:hAnsi="Calibri" w:cs="Calibri"/>
                 <w:b/>
-                <w:sz w:val="22"/>
-                <w:szCs w:val="22"/>
               </w:rPr>
             </w:pPr>
             <w:r>
               <w:rPr>
                 <w:rFonts w:ascii="Calibri" w:hAnsi="Calibri" w:cs="Calibri"/>
                 <w:b/>
-                <w:sz w:val="22"/>
-                <w:szCs w:val="22"/>
               </w:rPr>
               <w:t>Observation</w:t>
             </w:r>
@@ -362,16 +380,12 @@
               <w:rPr>
                 <w:rFonts w:ascii="Calibri" w:hAnsi="Calibri" w:cs="Calibri"/>
                 <w:b/>
-                <w:sz w:val="22"/>
-                <w:szCs w:val="22"/>
               </w:rPr>
             </w:pPr>
             <w:r>
               <w:rPr>
                 <w:rFonts w:ascii="Calibri" w:hAnsi="Calibri" w:cs="Calibri"/>
                 <w:b/>
-                <w:sz w:val="22"/>
-                <w:szCs w:val="22"/>
               </w:rPr>
               <w:t>Result</w:t>
             </w:r>
@@ -386,16 +400,12 @@
               <w:rPr>
                 <w:rFonts w:ascii="Calibri" w:hAnsi="Calibri" w:cs="Calibri"/>
                 <w:b/>
-                <w:sz w:val="22"/>
-                <w:szCs w:val="22"/>
               </w:rPr>
             </w:pPr>
             <w:r>
               <w:rPr>
                 <w:rFonts w:ascii="Calibri" w:hAnsi="Calibri" w:cs="Calibri"/>
                 <w:b/>
-                <w:sz w:val="22"/>
-                <w:szCs w:val="22"/>
               </w:rPr>
               <w:t>Evidence</w:t>
             </w:r>
@@ -411,15 +421,11 @@
             <w:pPr>
               <w:rPr>
                 <w:rFonts w:ascii="Calibri" w:hAnsi="Calibri" w:cs="Calibri"/>
-                <w:sz w:val="22"/>
-                <w:szCs w:val="22"/>
               </w:rPr>
             </w:pPr>
             <w:r>
               <w:rPr>
                 <w:rFonts w:ascii="Calibri" w:hAnsi="Calibri" w:cs="Calibri"/>
-                <w:sz w:val="22"/>
-                <w:szCs w:val="22"/>
               </w:rPr>
               <w:t xml:space="preserve">Ordinary </w:t>
             </w:r>
@@ -427,8 +433,6 @@
             <w:r>
               <w:rPr>
                 <w:rFonts w:ascii="Calibri" w:hAnsi="Calibri" w:cs="Calibri"/>
-                <w:sz w:val="22"/>
-                <w:szCs w:val="22"/>
               </w:rPr>
               <w:t>empty</w:t>
             </w:r>
@@ -436,8 +440,6 @@
             <w:r>
               <w:rPr>
                 <w:rFonts w:ascii="Calibri" w:hAnsi="Calibri" w:cs="Calibri"/>
-                <w:sz w:val="22"/>
-                <w:szCs w:val="22"/>
               </w:rPr>
               <w:t xml:space="preserve"> submit</w:t>
             </w:r>
@@ -451,15 +453,11 @@
             <w:pPr>
               <w:rPr>
                 <w:rFonts w:ascii="Calibri" w:hAnsi="Calibri" w:cs="Calibri"/>
-                <w:sz w:val="22"/>
-                <w:szCs w:val="22"/>
               </w:rPr>
             </w:pPr>
             <w:r>
               <w:rPr>
                 <w:rFonts w:ascii="Calibri" w:hAnsi="Calibri" w:cs="Calibri"/>
-                <w:sz w:val="22"/>
-                <w:szCs w:val="22"/>
               </w:rPr>
               <w:t>Street is required. appears beside the nested field and no POST is sent.</w:t>
             </w:r>
@@ -473,15 +471,11 @@
             <w:pPr>
               <w:rPr>
                 <w:rFonts w:ascii="Calibri" w:hAnsi="Calibri" w:cs="Calibri"/>
-                <w:sz w:val="22"/>
-                <w:szCs w:val="22"/>
               </w:rPr>
             </w:pPr>
             <w:r>
               <w:rPr>
                 <w:rFonts w:ascii="Calibri" w:hAnsi="Calibri" w:cs="Calibri"/>
-                <w:sz w:val="22"/>
-                <w:szCs w:val="22"/>
               </w:rPr>
               <w:t>Pass</w:t>
             </w:r>
@@ -495,8 +489,6 @@
             <w:pPr>
               <w:rPr>
                 <w:rFonts w:ascii="Calibri" w:hAnsi="Calibri" w:cs="Calibri"/>
-                <w:sz w:val="22"/>
-                <w:szCs w:val="22"/>
               </w:rPr>
             </w:pPr>
             <w:hyperlink r:id="rId8" w:history="1">
@@ -504,8 +496,6 @@
                 <w:rPr>
                   <w:rStyle w:val="Hyperlink"/>
                   <w:rFonts w:ascii="Calibri" w:hAnsi="Calibri" w:cs="Calibri"/>
-                  <w:sz w:val="22"/>
-                  <w:szCs w:val="22"/>
                 </w:rPr>
                 <w:t>Ordinary-submit recording</w:t>
               </w:r>
@@ -522,15 +512,11 @@
             <w:pPr>
               <w:rPr>
                 <w:rFonts w:ascii="Calibri" w:hAnsi="Calibri" w:cs="Calibri"/>
-                <w:sz w:val="22"/>
-                <w:szCs w:val="22"/>
               </w:rPr>
             </w:pPr>
             <w:r>
               <w:rPr>
                 <w:rFonts w:ascii="Calibri" w:hAnsi="Calibri" w:cs="Calibri"/>
-                <w:sz w:val="22"/>
-                <w:szCs w:val="22"/>
               </w:rPr>
               <w:t xml:space="preserve">Empty </w:t>
             </w:r>
@@ -538,8 +524,6 @@
             <w:r>
               <w:rPr>
                 <w:rFonts w:ascii="Calibri" w:hAnsi="Calibri" w:cs="Calibri"/>
-                <w:sz w:val="22"/>
-                <w:szCs w:val="22"/>
               </w:rPr>
               <w:t>formnovalidate</w:t>
             </w:r>
@@ -547,8 +531,6 @@
             <w:r>
               <w:rPr>
                 <w:rFonts w:ascii="Calibri" w:hAnsi="Calibri" w:cs="Calibri"/>
-                <w:sz w:val="22"/>
-                <w:szCs w:val="22"/>
               </w:rPr>
               <w:t xml:space="preserve"> submit</w:t>
             </w:r>
@@ -562,15 +544,11 @@
             <w:pPr>
               <w:rPr>
                 <w:rFonts w:ascii="Calibri" w:hAnsi="Calibri" w:cs="Calibri"/>
-                <w:sz w:val="22"/>
-                <w:szCs w:val="22"/>
               </w:rPr>
             </w:pPr>
             <w:r>
               <w:rPr>
                 <w:rFonts w:ascii="Calibri" w:hAnsi="Calibri" w:cs="Calibri"/>
-                <w:sz w:val="22"/>
-                <w:szCs w:val="22"/>
               </w:rPr>
               <w:t>The POST contains an empty nested street; server response HTML returns the same field message and no confirmation.</w:t>
             </w:r>
@@ -584,15 +562,11 @@
             <w:pPr>
               <w:rPr>
                 <w:rFonts w:ascii="Calibri" w:hAnsi="Calibri" w:cs="Calibri"/>
-                <w:sz w:val="22"/>
-                <w:szCs w:val="22"/>
               </w:rPr>
             </w:pPr>
             <w:r>
               <w:rPr>
                 <w:rFonts w:ascii="Calibri" w:hAnsi="Calibri" w:cs="Calibri"/>
-                <w:sz w:val="22"/>
-                <w:szCs w:val="22"/>
               </w:rPr>
               <w:t>Pass</w:t>
             </w:r>
@@ -606,8 +580,6 @@
             <w:pPr>
               <w:rPr>
                 <w:rFonts w:ascii="Calibri" w:hAnsi="Calibri" w:cs="Calibri"/>
-                <w:sz w:val="22"/>
-                <w:szCs w:val="22"/>
               </w:rPr>
             </w:pPr>
             <w:hyperlink r:id="rId9" w:history="1">
@@ -615,8 +587,6 @@
                 <w:rPr>
                   <w:rStyle w:val="Hyperlink"/>
                   <w:rFonts w:ascii="Calibri" w:hAnsi="Calibri" w:cs="Calibri"/>
-                  <w:sz w:val="22"/>
-                  <w:szCs w:val="22"/>
                 </w:rPr>
                 <w:t>Invalid-POST wire recording</w:t>
               </w:r>
@@ -633,16 +603,13 @@
             <w:pPr>
               <w:rPr>
                 <w:rFonts w:ascii="Calibri" w:hAnsi="Calibri" w:cs="Calibri"/>
-                <w:sz w:val="22"/>
-                <w:szCs w:val="22"/>
               </w:rPr>
             </w:pPr>
             <w:r>
               <w:rPr>
                 <w:rFonts w:ascii="Calibri" w:hAnsi="Calibri" w:cs="Calibri"/>
-                <w:sz w:val="22"/>
-                <w:szCs w:val="22"/>
-              </w:rPr>
+              </w:rPr>
+              <w:lastRenderedPageBreak/>
               <w:t>Corrected ordinary submit</w:t>
             </w:r>
           </w:p>
@@ -655,15 +622,11 @@
             <w:pPr>
               <w:rPr>
                 <w:rFonts w:ascii="Calibri" w:hAnsi="Calibri" w:cs="Calibri"/>
-                <w:sz w:val="22"/>
-                <w:szCs w:val="22"/>
               </w:rPr>
             </w:pPr>
             <w:r>
               <w:rPr>
                 <w:rFonts w:ascii="Calibri" w:hAnsi="Calibri" w:cs="Calibri"/>
-                <w:sz w:val="22"/>
-                <w:szCs w:val="22"/>
               </w:rPr>
               <w:t>The POST contains 123 Main Street; the 200 response returns the valid-order confirmation.</w:t>
             </w:r>
@@ -677,15 +640,11 @@
             <w:pPr>
               <w:rPr>
                 <w:rFonts w:ascii="Calibri" w:hAnsi="Calibri" w:cs="Calibri"/>
-                <w:sz w:val="22"/>
-                <w:szCs w:val="22"/>
               </w:rPr>
             </w:pPr>
             <w:r>
               <w:rPr>
                 <w:rFonts w:ascii="Calibri" w:hAnsi="Calibri" w:cs="Calibri"/>
-                <w:sz w:val="22"/>
-                <w:szCs w:val="22"/>
               </w:rPr>
               <w:t>Pass</w:t>
             </w:r>
@@ -699,8 +658,6 @@
             <w:pPr>
               <w:rPr>
                 <w:rFonts w:ascii="Calibri" w:hAnsi="Calibri" w:cs="Calibri"/>
-                <w:sz w:val="22"/>
-                <w:szCs w:val="22"/>
               </w:rPr>
             </w:pPr>
             <w:hyperlink r:id="rId10" w:history="1">
@@ -708,8 +665,6 @@
                 <w:rPr>
                   <w:rStyle w:val="Hyperlink"/>
                   <w:rFonts w:ascii="Calibri" w:hAnsi="Calibri" w:cs="Calibri"/>
-                  <w:sz w:val="22"/>
-                  <w:szCs w:val="22"/>
                 </w:rPr>
                 <w:t>Corrected-POST wire evidence</w:t>
               </w:r>
@@ -722,8 +677,6 @@
       <w:pPr>
         <w:rPr>
           <w:rFonts w:ascii="Calibri" w:hAnsi="Calibri" w:cs="Calibri"/>
-          <w:sz w:val="22"/>
-          <w:szCs w:val="22"/>
         </w:rPr>
       </w:pPr>
     </w:p>
@@ -732,15 +685,11 @@
         <w:pStyle w:val="Heading1"/>
         <w:rPr>
           <w:rFonts w:ascii="Calibri" w:hAnsi="Calibri" w:cs="Calibri"/>
-          <w:sz w:val="22"/>
-          <w:szCs w:val="22"/>
-        </w:rPr>
-      </w:pPr>
-      <w:r>
-        <w:rPr>
-          <w:rFonts w:ascii="Calibri" w:hAnsi="Calibri" w:cs="Calibri"/>
-          <w:sz w:val="22"/>
-          <w:szCs w:val="22"/>
+        </w:rPr>
+      </w:pPr>
+      <w:r>
+        <w:rPr>
+          <w:rFonts w:ascii="Calibri" w:hAnsi="Calibri" w:cs="Calibri"/>
         </w:rPr>
         <w:t>Supporting evidence</w:t>
       </w:r>
@@ -749,8 +698,6 @@
       <w:pPr>
         <w:rPr>
           <w:rFonts w:ascii="Calibri" w:hAnsi="Calibri" w:cs="Calibri"/>
-          <w:sz w:val="22"/>
-          <w:szCs w:val="22"/>
         </w:rPr>
       </w:pPr>
       <w:hyperlink r:id="rId11" w:history="1">
@@ -758,8 +705,6 @@
           <w:rPr>
             <w:rStyle w:val="Hyperlink"/>
             <w:rFonts w:ascii="Calibri" w:hAnsi="Calibri" w:cs="Calibri"/>
-            <w:sz w:val="22"/>
-            <w:szCs w:val="22"/>
           </w:rPr>
           <w:t>Corrected valid POST confirmation screenshot</w:t>
         </w:r>
@@ -769,8 +714,6 @@
       <w:pPr>
         <w:rPr>
           <w:rFonts w:ascii="Calibri" w:hAnsi="Calibri" w:cs="Calibri"/>
-          <w:sz w:val="22"/>
-          <w:szCs w:val="22"/>
         </w:rPr>
       </w:pPr>
       <w:hyperlink r:id="rId12" w:history="1">
@@ -778,8 +721,6 @@
           <w:rPr>
             <w:rStyle w:val="Hyperlink"/>
             <w:rFonts w:ascii="Calibri" w:hAnsi="Calibri" w:cs="Calibri"/>
-            <w:sz w:val="22"/>
-            <w:szCs w:val="22"/>
           </w:rPr>
           <w:t>Browser console evidence</w:t>
         </w:r>
@@ -789,8 +730,6 @@
       <w:pPr>
         <w:rPr>
           <w:rFonts w:ascii="Calibri" w:hAnsi="Calibri" w:cs="Calibri"/>
-          <w:sz w:val="22"/>
-          <w:szCs w:val="22"/>
         </w:rPr>
       </w:pPr>
       <w:hyperlink r:id="rId13" w:history="1">
@@ -798,10 +737,8 @@
           <w:rPr>
             <w:rStyle w:val="Hyperlink"/>
             <w:rFonts w:ascii="Calibri" w:hAnsi="Calibri" w:cs="Calibri"/>
-            <w:sz w:val="22"/>
-            <w:szCs w:val="22"/>
           </w:rPr>
-          <w:t>.NET console evidence</w:t>
+          <w:t>Visual Studio .NET console evidence</w:t>
         </w:r>
       </w:hyperlink>
     </w:p>
@@ -809,8 +746,6 @@
       <w:pPr>
         <w:rPr>
           <w:rFonts w:ascii="Calibri" w:hAnsi="Calibri" w:cs="Calibri"/>
-          <w:sz w:val="22"/>
-          <w:szCs w:val="22"/>
         </w:rPr>
       </w:pPr>
       <w:hyperlink r:id="rId14" w:history="1">
@@ -818,10 +753,8 @@
           <w:rPr>
             <w:rStyle w:val="Hyperlink"/>
             <w:rFonts w:ascii="Calibri" w:hAnsi="Calibri" w:cs="Calibri"/>
-            <w:sz w:val="22"/>
-            <w:szCs w:val="22"/>
           </w:rPr>
-          <w:t>No warnings or errors evidence</w:t>
+          <w:t>Visual Studio no warnings or errors evidence</w:t>
         </w:r>
       </w:hyperlink>
     </w:p>
@@ -830,17 +763,12 @@
         <w:pStyle w:val="Heading1"/>
         <w:rPr>
           <w:rFonts w:ascii="Calibri" w:hAnsi="Calibri" w:cs="Calibri"/>
-          <w:sz w:val="22"/>
-          <w:szCs w:val="22"/>
-        </w:rPr>
-      </w:pPr>
-      <w:r>
-        <w:rPr>
-          <w:rFonts w:ascii="Calibri" w:hAnsi="Calibri" w:cs="Calibri"/>
-          <w:sz w:val="22"/>
-          <w:szCs w:val="22"/>
-        </w:rPr>
-        <w:lastRenderedPageBreak/>
+        </w:rPr>
+      </w:pPr>
+      <w:r>
+        <w:rPr>
+          <w:rFonts w:ascii="Calibri" w:hAnsi="Calibri" w:cs="Calibri"/>
+        </w:rPr>
         <w:t>Conclusion</w:t>
       </w:r>
     </w:p>
@@ -848,17 +776,13 @@
       <w:pPr>
         <w:rPr>
           <w:rFonts w:ascii="Calibri" w:hAnsi="Calibri" w:cs="Calibri"/>
-          <w:sz w:val="22"/>
-          <w:szCs w:val="22"/>
-        </w:rPr>
-      </w:pPr>
-      <w:r>
-        <w:rPr>
-          <w:rFonts w:ascii="Calibri" w:hAnsi="Calibri" w:cs="Calibri"/>
-          <w:sz w:val="22"/>
-          <w:szCs w:val="22"/>
-        </w:rPr>
-        <w:t>Passed. All three selected Static SSR checks produced the expected behavior. The evidence confirms nested client validation, server rejection of the invalid bypass POST, and successful submission after correction. No Blazor product failure was found.</w:t>
+        </w:rPr>
+      </w:pPr>
+      <w:r>
+        <w:rPr>
+          <w:rFonts w:ascii="Calibri" w:hAnsi="Calibri" w:cs="Calibri"/>
+        </w:rPr>
+        <w:t>Works. All three selected Static SSR checks produced the expected behavior. The evidence confirms nested client validation, server rejection of the invalid bypass POST, and successful submission after correction. No Blazor product failure was found.</w:t>
       </w:r>
     </w:p>
     <w:p>
@@ -866,15 +790,11 @@
         <w:pStyle w:val="Heading1"/>
         <w:rPr>
           <w:rFonts w:ascii="Calibri" w:hAnsi="Calibri" w:cs="Calibri"/>
-          <w:sz w:val="22"/>
-          <w:szCs w:val="22"/>
-        </w:rPr>
-      </w:pPr>
-      <w:r>
-        <w:rPr>
-          <w:rFonts w:ascii="Calibri" w:hAnsi="Calibri" w:cs="Calibri"/>
-          <w:sz w:val="22"/>
-          <w:szCs w:val="22"/>
+        </w:rPr>
+      </w:pPr>
+      <w:r>
+        <w:rPr>
+          <w:rFonts w:ascii="Calibri" w:hAnsi="Calibri" w:cs="Calibri"/>
         </w:rPr>
         <w:t>Provenance</w:t>
       </w:r>
@@ -883,25 +803,31 @@
       <w:pPr>
         <w:rPr>
           <w:rFonts w:ascii="Calibri" w:hAnsi="Calibri" w:cs="Calibri"/>
-          <w:sz w:val="22"/>
-          <w:szCs w:val="22"/>
-        </w:rPr>
-      </w:pPr>
-      <w:r>
-        <w:rPr>
-          <w:rFonts w:ascii="Calibri" w:hAnsi="Calibri" w:cs="Calibri"/>
-          <w:sz w:val="22"/>
-          <w:szCs w:val="22"/>
-        </w:rPr>
-        <w:t>Tested source and complete committed evidence revision: dde733e3d352f079c0d11090f50afe2c42c4f7e7. This cleaned report is a documentation-only update and does not change the tested evidence revision. Posting the report to the scenario issue and notifying the scenario contact remain manual steps.</w:t>
-      </w:r>
-    </w:p>
-    <w:p>
-      <w:pPr>
-        <w:rPr>
-          <w:rFonts w:ascii="Calibri" w:hAnsi="Calibri" w:cs="Calibri"/>
-          <w:sz w:val="22"/>
-          <w:szCs w:val="22"/>
+        </w:rPr>
+      </w:pPr>
+      <w:r>
+        <w:rPr>
+          <w:rFonts w:ascii="Calibri" w:hAnsi="Calibri" w:cs="Calibri"/>
+        </w:rPr>
+        <w:t xml:space="preserve">Tested source and complete committed evidence revision: </w:t>
+      </w:r>
+      <w:r>
+        <w:rPr>
+          <w:rFonts w:ascii="Calibri" w:hAnsi="Calibri" w:cs="Calibri"/>
+        </w:rPr>
+        <w:t>f01040bd205f6aade6c1e9e5ec45cc47c397c1c3</w:t>
+      </w:r>
+      <w:r>
+        <w:rPr>
+          <w:rFonts w:ascii="Calibri" w:hAnsi="Calibri" w:cs="Calibri"/>
+        </w:rPr>
+        <w:t>. This report update is documentation-only and does not change the tested evidence revision. Posting the report to the scenario issue and notifying the scenario contact remain manual steps.</w:t>
+      </w:r>
+    </w:p>
+    <w:p>
+      <w:pPr>
+        <w:rPr>
+          <w:rFonts w:ascii="Calibri" w:hAnsi="Calibri" w:cs="Calibri"/>
         </w:rPr>
       </w:pPr>
     </w:p>
@@ -1676,6 +1602,7 @@
   <w:style w:type="character" w:default="1" w:styleId="DefaultParagraphFont">
     <w:name w:val="Default Paragraph Font"/>
     <w:uiPriority w:val="1"/>
+    <w:semiHidden/>
     <w:unhideWhenUsed/>
   </w:style>
   <w:style w:type="table" w:default="1" w:styleId="TableNormal">

</xml_diff>